<commit_message>
small changes, templates are now creatable via API
</commit_message>
<xml_diff>
--- a/templates/4 Tvarkos/3 Mobingo Tvarka 2023.docx
+++ b/templates/4 Tvarkos/3 Mobingo Tvarka 2023.docx
@@ -1,6 +1,6 @@
 
 <file path=word/document.xml><?xml version="1.0" encoding="utf-8"?>
-<w:document xmlns:wpc="http://schemas.microsoft.com/office/word/2010/wordprocessingCanvas" xmlns:cx="http://schemas.microsoft.com/office/drawing/2014/chartex" xmlns:cx1="http://schemas.microsoft.com/office/drawing/2015/9/8/chartex" xmlns:cx2="http://schemas.microsoft.com/office/drawing/2015/10/21/chartex" xmlns:cx3="http://schemas.microsoft.com/office/drawing/2016/5/9/chartex" xmlns:cx4="http://schemas.microsoft.com/office/drawing/2016/5/10/chartex" xmlns:cx5="http://schemas.microsoft.com/office/drawing/2016/5/11/chartex" xmlns:cx6="http://schemas.microsoft.com/office/drawing/2016/5/12/chartex" xmlns:cx7="http://schemas.microsoft.com/office/drawing/2016/5/13/chartex" xmlns:cx8="http://schemas.microsoft.com/office/drawing/2016/5/14/chartex" xmlns:mc="http://schemas.openxmlformats.org/markup-compatibility/2006" xmlns:aink="http://schemas.microsoft.com/office/drawing/2016/ink" xmlns:am3d="http://schemas.microsoft.com/office/drawing/2017/model3d" xmlns:o="urn:schemas-microsoft-com:office:office" xmlns:oel="http://schemas.microsoft.com/office/2019/extlst" xmlns:r="http://schemas.openxmlformats.org/officeDocument/2006/relationships" xmlns:m="http://schemas.openxmlformats.org/officeDocument/2006/math" xmlns:v="urn:schemas-microsoft-com:vml" xmlns:wp14="http://schemas.microsoft.com/office/word/2010/wordprocessingDrawing" xmlns:wp="http://schemas.openxmlformats.org/drawingml/2006/wordprocessingDrawing" xmlns:w10="urn:schemas-microsoft-com:office:word" xmlns:w="http://schemas.openxmlformats.org/wordprocessingml/2006/main" xmlns:w14="http://schemas.microsoft.com/office/word/2010/wordml" xmlns:w15="http://schemas.microsoft.com/office/word/2012/wordml" xmlns:w16cex="http://schemas.microsoft.com/office/word/2018/wordml/cex" xmlns:w16cid="http://schemas.microsoft.com/office/word/2016/wordml/cid" xmlns:w16="http://schemas.microsoft.com/office/word/2018/wordml" xmlns:w16sdtdh="http://schemas.microsoft.com/office/word/2020/wordml/sdtdatahash" xmlns:w16se="http://schemas.microsoft.com/office/word/2015/wordml/symex" xmlns:wpg="http://schemas.microsoft.com/office/word/2010/wordprocessingGroup" xmlns:wpi="http://schemas.microsoft.com/office/word/2010/wordprocessingInk" xmlns:wne="http://schemas.microsoft.com/office/word/2006/wordml" xmlns:wps="http://schemas.microsoft.com/office/word/2010/wordprocessingShape" mc:Ignorable="w14 w15 w16se w16cid w16 w16cex w16sdtdh wp14">
+<w:document xmlns:wpc="http://schemas.microsoft.com/office/word/2010/wordprocessingCanvas" xmlns:cx="http://schemas.microsoft.com/office/drawing/2014/chartex" xmlns:cx1="http://schemas.microsoft.com/office/drawing/2015/9/8/chartex" xmlns:cx2="http://schemas.microsoft.com/office/drawing/2015/10/21/chartex" xmlns:cx3="http://schemas.microsoft.com/office/drawing/2016/5/9/chartex" xmlns:cx4="http://schemas.microsoft.com/office/drawing/2016/5/10/chartex" xmlns:cx5="http://schemas.microsoft.com/office/drawing/2016/5/11/chartex" xmlns:cx6="http://schemas.microsoft.com/office/drawing/2016/5/12/chartex" xmlns:cx7="http://schemas.microsoft.com/office/drawing/2016/5/13/chartex" xmlns:cx8="http://schemas.microsoft.com/office/drawing/2016/5/14/chartex" xmlns:mc="http://schemas.openxmlformats.org/markup-compatibility/2006" xmlns:aink="http://schemas.microsoft.com/office/drawing/2016/ink" xmlns:am3d="http://schemas.microsoft.com/office/drawing/2017/model3d" xmlns:o="urn:schemas-microsoft-com:office:office" xmlns:oel="http://schemas.microsoft.com/office/2019/extlst" xmlns:r="http://schemas.openxmlformats.org/officeDocument/2006/relationships" xmlns:m="http://schemas.openxmlformats.org/officeDocument/2006/math" xmlns:v="urn:schemas-microsoft-com:vml" xmlns:wp14="http://schemas.microsoft.com/office/word/2010/wordprocessingDrawing" xmlns:wp="http://schemas.openxmlformats.org/drawingml/2006/wordprocessingDrawing" xmlns:w10="urn:schemas-microsoft-com:office:word" xmlns:w="http://schemas.openxmlformats.org/wordprocessingml/2006/main" xmlns:w14="http://schemas.microsoft.com/office/word/2010/wordml" xmlns:w15="http://schemas.microsoft.com/office/word/2012/wordml" xmlns:w16cex="http://schemas.microsoft.com/office/word/2018/wordml/cex" xmlns:w16cid="http://schemas.microsoft.com/office/word/2016/wordml/cid" xmlns:w16="http://schemas.microsoft.com/office/word/2018/wordml" xmlns:w16du="http://schemas.microsoft.com/office/word/2023/wordml/word16du" xmlns:w16sdtdh="http://schemas.microsoft.com/office/word/2020/wordml/sdtdatahash" xmlns:w16sdtfl="http://schemas.microsoft.com/office/word/2024/wordml/sdtformatlock" xmlns:w16se="http://schemas.microsoft.com/office/word/2015/wordml/symex" xmlns:wpg="http://schemas.microsoft.com/office/word/2010/wordprocessingGroup" xmlns:wpi="http://schemas.microsoft.com/office/word/2010/wordprocessingInk" xmlns:wne="http://schemas.microsoft.com/office/word/2006/wordml" xmlns:wps="http://schemas.microsoft.com/office/word/2010/wordprocessingShape" mc:Ignorable="w14 w15 w16se w16cid w16 w16cex w16sdtdh w16sdtfl w16du wp14">
   <w:body>
     <w:p>
       <w:pPr>
@@ -16,9 +16,15 @@
         <w:rPr>
           <w:rFonts w:ascii="Times New Roman" w:eastAsia="Times New Roman" w:hAnsi="Times New Roman"/>
           <w:b/>
-          <w:highlight w:val="yellow"/>
-        </w:rPr>
-        <w:t>UŽDAROJI AKCINĖ BENDROVĖ „XXX“</w:t>
+        </w:rPr>
+        <w:t>${company</w:t>
+      </w:r>
+      <w:r>
+        <w:rPr>
+          <w:rFonts w:ascii="Times New Roman" w:eastAsia="Times New Roman" w:hAnsi="Times New Roman"/>
+          <w:b/>
+        </w:rPr>
+        <w:t>}</w:t>
       </w:r>
     </w:p>
     <w:p>
@@ -38,9 +44,8 @@
           <w:b/>
           <w:bCs/>
           <w:szCs w:val="20"/>
-          <w:highlight w:val="yellow"/>
-        </w:rPr>
-        <w:t>DIREKTORIUS</w:t>
+        </w:rPr>
+        <w:t>${role}</w:t>
       </w:r>
     </w:p>
     <w:p>
@@ -164,17 +169,8 @@
           <w:rFonts w:ascii="Times New Roman" w:eastAsia="Times New Roman" w:hAnsi="Times New Roman"/>
           <w:sz w:val="24"/>
           <w:szCs w:val="24"/>
-          <w:highlight w:val="yellow"/>
-        </w:rPr>
-        <w:t>2026 m sausio 16 d.</w:t>
-      </w:r>
-      <w:r>
-        <w:rPr>
-          <w:rFonts w:ascii="Times New Roman" w:eastAsia="Times New Roman" w:hAnsi="Times New Roman"/>
-          <w:sz w:val="24"/>
-          <w:szCs w:val="24"/>
-        </w:rPr>
-        <w:t xml:space="preserve"> </w:t>
+        </w:rPr>
+        <w:t xml:space="preserve">${instructionDate} </w:t>
       </w:r>
       <w:r>
         <w:rPr>
@@ -2915,7 +2911,7 @@
               </wp:anchor>
             </w:drawing>
           </mc:Choice>
-          <mc:Fallback xmlns:w16du="http://schemas.microsoft.com/office/word/2023/wordml/word16du" xmlns:w16sdtfl="http://schemas.microsoft.com/office/word/2024/wordml/sdtformatlock">
+          <mc:Fallback>
             <w:pict>
               <v:shapetype w14:anchorId="6300395B" id="_x0000_t32" coordsize="21600,21600" o:spt="32" o:oned="t" path="m,l21600,21600e" filled="f">
                 <v:path arrowok="t" fillok="f" o:connecttype="none"/>
@@ -2979,7 +2975,7 @@
               </wp:anchor>
             </w:drawing>
           </mc:Choice>
-          <mc:Fallback xmlns:w16du="http://schemas.microsoft.com/office/word/2023/wordml/word16du" xmlns:w16sdtfl="http://schemas.microsoft.com/office/word/2024/wordml/sdtformatlock">
+          <mc:Fallback>
             <w:pict>
               <v:shape w14:anchorId="537ABA7A" id="Tiesioji jungtis 34" o:spid="_x0000_s1026" type="#_x0000_t32" style="position:absolute;margin-left:245.1pt;margin-top:232.6pt;width:0;height:14.4pt;z-index:251669504;visibility:visible;mso-wrap-style:square;mso-wrap-distance-left:9pt;mso-wrap-distance-top:0;mso-wrap-distance-right:9pt;mso-wrap-distance-bottom:0;mso-position-horizontal:absolute;mso-position-horizontal-relative:text;mso-position-vertical:absolute;mso-position-vertical-relative:text" o:gfxdata="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" strokecolor="red" strokeweight="2.25pt">
                 <v:stroke joinstyle="miter"/>
@@ -3039,7 +3035,7 @@
               </wp:anchor>
             </w:drawing>
           </mc:Choice>
-          <mc:Fallback xmlns:w16du="http://schemas.microsoft.com/office/word/2023/wordml/word16du" xmlns:w16sdtfl="http://schemas.microsoft.com/office/word/2024/wordml/sdtformatlock">
+          <mc:Fallback>
             <w:pict>
               <v:shape w14:anchorId="374F8582" id="Tiesioji jungtis 33" o:spid="_x0000_s1026" type="#_x0000_t32" style="position:absolute;margin-left:372.25pt;margin-top:213.25pt;width:0;height:19.2pt;z-index:251668480;visibility:visible;mso-wrap-style:square;mso-wrap-distance-left:9pt;mso-wrap-distance-top:0;mso-wrap-distance-right:9pt;mso-wrap-distance-bottom:0;mso-position-horizontal:absolute;mso-position-horizontal-relative:text;mso-position-vertical:absolute;mso-position-vertical-relative:text" o:gfxdata="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" strokecolor="red" strokeweight=".52906mm">
                 <v:stroke joinstyle="miter"/>
@@ -3099,7 +3095,7 @@
               </wp:anchor>
             </w:drawing>
           </mc:Choice>
-          <mc:Fallback xmlns:w16du="http://schemas.microsoft.com/office/word/2023/wordml/word16du" xmlns:w16sdtfl="http://schemas.microsoft.com/office/word/2024/wordml/sdtformatlock">
+          <mc:Fallback>
             <w:pict>
               <v:shape w14:anchorId="31E20DDB" id="Tiesioji jungtis 9" o:spid="_x0000_s1026" type="#_x0000_t32" style="position:absolute;margin-left:108.95pt;margin-top:232.25pt;width:264pt;height:.45pt;z-index:251663360;visibility:visible;mso-wrap-style:square;mso-wrap-distance-left:9pt;mso-wrap-distance-top:0;mso-wrap-distance-right:9pt;mso-wrap-distance-bottom:0;mso-position-horizontal:absolute;mso-position-horizontal-relative:text;mso-position-vertical:absolute;mso-position-vertical-relative:text" o:gfxdata="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" strokecolor="red" strokeweight=".52906mm">
                 <v:stroke joinstyle="miter"/>
@@ -4244,7 +4240,7 @@
               </wp:inline>
             </w:drawing>
           </mc:Choice>
-          <mc:Fallback xmlns:w16du="http://schemas.microsoft.com/office/word/2023/wordml/word16du" xmlns:w16sdtfl="http://schemas.microsoft.com/office/word/2024/wordml/sdtformatlock">
+          <mc:Fallback>
             <w:pict>
               <v:group w14:anchorId="65CED688" id="Diagrama 4" o:spid="_x0000_s1026" style="width:501.7pt;height:339.3pt;mso-position-horizontal-relative:char;mso-position-vertical-relative:line" coordsize="62778,42569" o:gfxdata="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">
                 <v:rect id="Stačiakampis 6" o:spid="_x0000_s1027" style="position:absolute;width:62778;height:41505;visibility:visible;mso-wrap-style:square;v-text-anchor:top" o:gfxdata="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" filled="f" stroked="f">
@@ -4603,7 +4599,7 @@
               </wp:anchor>
             </w:drawing>
           </mc:Choice>
-          <mc:Fallback xmlns:w16du="http://schemas.microsoft.com/office/word/2023/wordml/word16du" xmlns:w16sdtfl="http://schemas.microsoft.com/office/word/2024/wordml/sdtformatlock">
+          <mc:Fallback>
             <w:pict>
               <v:shapetype w14:anchorId="647C48EE" id="_x0000_t67" coordsize="21600,21600" o:spt="67" adj="16200,5400" path="m0@0l@1@0@1,0@2,0@2@0,21600@0,10800,21600xe">
                 <v:stroke joinstyle="miter"/>
@@ -4868,7 +4864,7 @@
               </wp:anchor>
             </w:drawing>
           </mc:Choice>
-          <mc:Fallback xmlns:w16du="http://schemas.microsoft.com/office/word/2023/wordml/word16du" xmlns:w16sdtfl="http://schemas.microsoft.com/office/word/2024/wordml/sdtformatlock">
+          <mc:Fallback>
             <w:pict>
               <v:shapetype w14:anchorId="6611130E" id="_x0000_t202" coordsize="21600,21600" o:spt="202" path="m,l,21600r21600,l21600,xe">
                 <v:stroke joinstyle="miter"/>
@@ -4999,7 +4995,7 @@
               </wp:anchor>
             </w:drawing>
           </mc:Choice>
-          <mc:Fallback xmlns:w16du="http://schemas.microsoft.com/office/word/2023/wordml/word16du" xmlns:w16sdtfl="http://schemas.microsoft.com/office/word/2024/wordml/sdtformatlock">
+          <mc:Fallback>
             <w:pict>
               <v:shape w14:anchorId="7F4004AD" id="_x0000_s1036" type="#_x0000_t202" style="position:absolute;left:0;text-align:left;margin-left:262.1pt;margin-top:179.6pt;width:67.2pt;height:32.25pt;z-index:251695104;visibility:visible;mso-wrap-style:square;mso-width-percent:0;mso-height-percent:0;mso-wrap-distance-left:9pt;mso-wrap-distance-top:0;mso-wrap-distance-right:9pt;mso-wrap-distance-bottom:0;mso-position-horizontal:absolute;mso-position-horizontal-relative:text;mso-position-vertical:absolute;mso-position-vertical-relative:text;mso-width-percent:0;mso-height-percent:0;mso-width-relative:margin;mso-height-relative:margin;v-text-anchor:top" o:gfxdata="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" fillcolor="white [3201]" stroked="f" strokeweight=".5pt">
                 <v:textbox>
@@ -5121,7 +5117,7 @@
               </wp:anchor>
             </w:drawing>
           </mc:Choice>
-          <mc:Fallback xmlns:w16du="http://schemas.microsoft.com/office/word/2023/wordml/word16du" xmlns:w16sdtfl="http://schemas.microsoft.com/office/word/2024/wordml/sdtformatlock">
+          <mc:Fallback>
             <w:pict>
               <v:shape w14:anchorId="3FFB0234" id="Text Box 23" o:spid="_x0000_s1037" type="#_x0000_t202" style="position:absolute;left:0;text-align:left;margin-left:174.6pt;margin-top:163.7pt;width:68.25pt;height:19.65pt;rotation:501890fd;z-index:251688960;visibility:visible;mso-wrap-style:square;mso-width-percent:0;mso-height-percent:0;mso-wrap-distance-left:9pt;mso-wrap-distance-top:0;mso-wrap-distance-right:9pt;mso-wrap-distance-bottom:0;mso-position-horizontal:absolute;mso-position-horizontal-relative:text;mso-position-vertical:absolute;mso-position-vertical-relative:text;mso-width-percent:0;mso-height-percent:0;mso-width-relative:margin;mso-height-relative:margin;v-text-anchor:top" o:gfxdata="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" fillcolor="white [3201]" stroked="f" strokeweight=".5pt">
                 <v:textbox>
@@ -5232,7 +5228,7 @@
               </wp:anchor>
             </w:drawing>
           </mc:Choice>
-          <mc:Fallback xmlns:w16du="http://schemas.microsoft.com/office/word/2023/wordml/word16du" xmlns:w16sdtfl="http://schemas.microsoft.com/office/word/2024/wordml/sdtformatlock">
+          <mc:Fallback>
             <w:pict>
               <v:shapetype w14:anchorId="0EC3D1D1" id="_x0000_t32" coordsize="21600,21600" o:spt="32" o:oned="t" path="m,l21600,21600e" filled="f">
                 <v:path arrowok="t" fillok="f" o:connecttype="none"/>
@@ -5339,7 +5335,7 @@
               </wp:anchor>
             </w:drawing>
           </mc:Choice>
-          <mc:Fallback xmlns:w16du="http://schemas.microsoft.com/office/word/2023/wordml/word16du" xmlns:w16sdtfl="http://schemas.microsoft.com/office/word/2024/wordml/sdtformatlock">
+          <mc:Fallback>
             <w:pict>
               <v:shape w14:anchorId="0AE2B0E1" id="_x0000_s1038" type="#_x0000_t202" style="position:absolute;left:0;text-align:left;margin-left:168.4pt;margin-top:14.55pt;width:68.25pt;height:19.65pt;rotation:-255748fd;z-index:251687936;visibility:visible;mso-wrap-style:square;mso-width-percent:0;mso-height-percent:0;mso-wrap-distance-left:9pt;mso-wrap-distance-top:0;mso-wrap-distance-right:9pt;mso-wrap-distance-bottom:0;mso-position-horizontal:absolute;mso-position-horizontal-relative:text;mso-position-vertical:absolute;mso-position-vertical-relative:text;mso-width-percent:0;mso-height-percent:0;mso-width-relative:margin;mso-height-relative:margin;v-text-anchor:top" o:gfxdata="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" fillcolor="white [3201]" stroked="f" strokeweight=".5pt">
                 <v:textbox>
@@ -5451,7 +5447,7 @@
               </wp:anchor>
             </w:drawing>
           </mc:Choice>
-          <mc:Fallback xmlns:w16du="http://schemas.microsoft.com/office/word/2023/wordml/word16du" xmlns:w16sdtfl="http://schemas.microsoft.com/office/word/2024/wordml/sdtformatlock">
+          <mc:Fallback>
             <w:pict>
               <v:shape w14:anchorId="0B5016FF" id="Straight Arrow Connector 22" o:spid="_x0000_s1026" type="#_x0000_t32" style="position:absolute;margin-left:164.9pt;margin-top:37.35pt;width:89.4pt;height:3.6pt;flip:y;z-index:251682816;visibility:visible;mso-wrap-style:square;mso-width-percent:0;mso-height-percent:0;mso-wrap-distance-left:9pt;mso-wrap-distance-top:0;mso-wrap-distance-right:9pt;mso-wrap-distance-bottom:0;mso-position-horizontal:absolute;mso-position-horizontal-relative:text;mso-position-vertical:absolute;mso-position-vertical-relative:text;mso-width-percent:0;mso-height-percent:0;mso-width-relative:margin;mso-height-relative:margin" o:gfxdata="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" strokecolor="black [3213]" strokeweight="4.5pt">
                 <v:stroke dashstyle="1 1" endarrow="block" joinstyle="miter"/>
@@ -5547,7 +5543,7 @@
               </wp:anchor>
             </w:drawing>
           </mc:Choice>
-          <mc:Fallback xmlns:w16du="http://schemas.microsoft.com/office/word/2023/wordml/word16du" xmlns:w16sdtfl="http://schemas.microsoft.com/office/word/2024/wordml/sdtformatlock">
+          <mc:Fallback>
             <w:pict>
               <v:shape w14:anchorId="1774172C" id="_x0000_s1039" type="#_x0000_t202" style="position:absolute;left:0;text-align:left;margin-left:259.1pt;margin-top:23pt;width:75pt;height:32.25pt;z-index:251693056;visibility:visible;mso-wrap-style:square;mso-width-percent:0;mso-height-percent:0;mso-wrap-distance-left:9pt;mso-wrap-distance-top:0;mso-wrap-distance-right:9pt;mso-wrap-distance-bottom:0;mso-position-horizontal:absolute;mso-position-horizontal-relative:text;mso-position-vertical:absolute;mso-position-vertical-relative:text;mso-width-percent:0;mso-height-percent:0;mso-width-relative:margin;mso-height-relative:margin;v-text-anchor:top" o:gfxdata="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" fillcolor="white [3201]" stroked="f" strokeweight=".5pt">
                 <v:textbox>
@@ -5652,7 +5648,7 @@
               </wp:anchor>
             </w:drawing>
           </mc:Choice>
-          <mc:Fallback xmlns:w16du="http://schemas.microsoft.com/office/word/2023/wordml/word16du" xmlns:w16sdtfl="http://schemas.microsoft.com/office/word/2024/wordml/sdtformatlock">
+          <mc:Fallback>
             <w:pict>
               <v:shape w14:anchorId="70131B6E" id="Straight Arrow Connector 22" o:spid="_x0000_s1026" type="#_x0000_t32" style="position:absolute;margin-left:153.5pt;margin-top:311pt;width:146.4pt;height:3.6pt;z-index:251686912;visibility:visible;mso-wrap-style:square;mso-width-percent:0;mso-height-percent:0;mso-wrap-distance-left:9pt;mso-wrap-distance-top:0;mso-wrap-distance-right:9pt;mso-wrap-distance-bottom:0;mso-position-horizontal:absolute;mso-position-horizontal-relative:text;mso-position-vertical:absolute;mso-position-vertical-relative:text;mso-width-percent:0;mso-height-percent:0;mso-width-relative:margin;mso-height-relative:margin" o:gfxdata="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" strokecolor="black [3213]" strokeweight="4.5pt">
                 <v:stroke dashstyle="1 1" endarrow="block" joinstyle="miter"/>
@@ -5731,7 +5727,7 @@
               </wp:anchor>
             </w:drawing>
           </mc:Choice>
-          <mc:Fallback xmlns:w16du="http://schemas.microsoft.com/office/word/2023/wordml/word16du" xmlns:w16sdtfl="http://schemas.microsoft.com/office/word/2024/wordml/sdtformatlock">
+          <mc:Fallback>
             <w:pict>
               <v:shape w14:anchorId="627ECC59" id="Straight Arrow Connector 22" o:spid="_x0000_s1026" type="#_x0000_t32" style="position:absolute;margin-left:164.6pt;margin-top:55.1pt;width:92.75pt;height:54.55pt;z-index:251683840;visibility:visible;mso-wrap-style:square;mso-width-percent:0;mso-height-percent:0;mso-wrap-distance-left:9pt;mso-wrap-distance-top:0;mso-wrap-distance-right:9pt;mso-wrap-distance-bottom:0;mso-position-horizontal:absolute;mso-position-horizontal-relative:text;mso-position-vertical:absolute;mso-position-vertical-relative:text;mso-width-percent:0;mso-height-percent:0;mso-width-relative:margin;mso-height-relative:margin" o:gfxdata="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" strokecolor="black [3213]" strokeweight="4.5pt">
                 <v:stroke endarrow="block" joinstyle="miter"/>
@@ -5811,7 +5807,7 @@
               </wp:anchor>
             </w:drawing>
           </mc:Choice>
-          <mc:Fallback xmlns:w16du="http://schemas.microsoft.com/office/word/2023/wordml/word16du" xmlns:w16sdtfl="http://schemas.microsoft.com/office/word/2024/wordml/sdtformatlock">
+          <mc:Fallback>
             <w:pict>
               <v:shape w14:anchorId="31382665" id="Straight Arrow Connector 22" o:spid="_x0000_s1026" type="#_x0000_t32" style="position:absolute;margin-left:160.1pt;margin-top:179.9pt;width:97.25pt;height:15.75pt;z-index:251685888;visibility:visible;mso-wrap-style:square;mso-width-percent:0;mso-height-percent:0;mso-wrap-distance-left:9pt;mso-wrap-distance-top:0;mso-wrap-distance-right:9pt;mso-wrap-distance-bottom:0;mso-position-horizontal:absolute;mso-position-horizontal-relative:text;mso-position-vertical:absolute;mso-position-vertical-relative:text;mso-width-percent:0;mso-height-percent:0;mso-width-relative:margin;mso-height-relative:margin" o:gfxdata="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" strokecolor="black [3213]" strokeweight="4.5pt">
                 <v:stroke dashstyle="1 1" endarrow="block" joinstyle="miter"/>
@@ -5914,7 +5910,7 @@
               </wp:anchor>
             </w:drawing>
           </mc:Choice>
-          <mc:Fallback xmlns:w16du="http://schemas.microsoft.com/office/word/2023/wordml/word16du" xmlns:w16sdtfl="http://schemas.microsoft.com/office/word/2024/wordml/sdtformatlock">
+          <mc:Fallback>
             <w:pict>
               <v:shape w14:anchorId="171EA623" id="_x0000_s1040" type="#_x0000_t202" style="position:absolute;left:0;text-align:left;margin-left:188.35pt;margin-top:61pt;width:68.25pt;height:19.65pt;rotation:1893985fd;z-index:251691008;visibility:visible;mso-wrap-style:square;mso-width-percent:0;mso-height-percent:0;mso-wrap-distance-left:9pt;mso-wrap-distance-top:0;mso-wrap-distance-right:9pt;mso-wrap-distance-bottom:0;mso-position-horizontal:absolute;mso-position-horizontal-relative:text;mso-position-vertical:absolute;mso-position-vertical-relative:text;mso-width-percent:0;mso-height-percent:0;mso-width-relative:margin;mso-height-relative:margin;v-text-anchor:top" o:gfxdata="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" fillcolor="white [3201]" stroked="f" strokeweight=".5pt">
                 <v:textbox>
@@ -6049,7 +6045,7 @@
               </wp:anchor>
             </w:drawing>
           </mc:Choice>
-          <mc:Fallback xmlns:w16du="http://schemas.microsoft.com/office/word/2023/wordml/word16du" xmlns:w16sdtfl="http://schemas.microsoft.com/office/word/2024/wordml/sdtformatlock">
+          <mc:Fallback>
             <w:pict>
               <v:shape w14:anchorId="3C2C0916" id="_x0000_s1041" type="#_x0000_t202" style="position:absolute;left:0;text-align:left;margin-left:166.8pt;margin-top:121.05pt;width:68.25pt;height:19.65pt;rotation:-1322444fd;z-index:251692032;visibility:visible;mso-wrap-style:square;mso-width-percent:0;mso-height-percent:0;mso-wrap-distance-left:9pt;mso-wrap-distance-top:0;mso-wrap-distance-right:9pt;mso-wrap-distance-bottom:0;mso-position-horizontal:absolute;mso-position-horizontal-relative:text;mso-position-vertical:absolute;mso-position-vertical-relative:text;mso-width-percent:0;mso-height-percent:0;mso-width-relative:margin;mso-height-relative:margin;v-text-anchor:top" o:gfxdata="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" fillcolor="white [3201]" stroked="f" strokeweight=".5pt">
                 <v:textbox>
@@ -6184,7 +6180,7 @@
               </wp:anchor>
             </w:drawing>
           </mc:Choice>
-          <mc:Fallback xmlns:w16du="http://schemas.microsoft.com/office/word/2023/wordml/word16du" xmlns:w16sdtfl="http://schemas.microsoft.com/office/word/2024/wordml/sdtformatlock">
+          <mc:Fallback>
             <w:pict>
               <v:shape w14:anchorId="69343579" id="_x0000_s1042" type="#_x0000_t202" style="position:absolute;left:0;text-align:left;margin-left:171.3pt;margin-top:287.65pt;width:120.75pt;height:19.65pt;z-index:251689984;visibility:visible;mso-wrap-style:square;mso-width-percent:0;mso-height-percent:0;mso-wrap-distance-left:9pt;mso-wrap-distance-top:0;mso-wrap-distance-right:9pt;mso-wrap-distance-bottom:0;mso-position-horizontal:absolute;mso-position-horizontal-relative:text;mso-position-vertical:absolute;mso-position-vertical-relative:text;mso-width-percent:0;mso-height-percent:0;mso-width-relative:margin;mso-height-relative:margin;v-text-anchor:top" o:gfxdata="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" fillcolor="white [3201]" stroked="f" strokeweight=".5pt">
                 <v:textbox>
@@ -6449,7 +6445,7 @@
               </wp:anchor>
             </w:drawing>
           </mc:Choice>
-          <mc:Fallback xmlns:w16du="http://schemas.microsoft.com/office/word/2023/wordml/word16du" xmlns:w16sdtfl="http://schemas.microsoft.com/office/word/2024/wordml/sdtformatlock">
+          <mc:Fallback>
             <w:pict>
               <v:roundrect w14:anchorId="05138E43" id="Stačiakampis: suapvalinti kampai 9" o:spid="_x0000_s1043" style="position:absolute;left:0;text-align:left;margin-left:325.05pt;margin-top:2.55pt;width:173.1pt;height:147.6pt;z-index:251676672;visibility:visible;mso-wrap-style:square;mso-width-percent:0;mso-height-percent:0;mso-wrap-distance-left:9pt;mso-wrap-distance-top:0;mso-wrap-distance-right:9pt;mso-wrap-distance-bottom:0;mso-position-horizontal:absolute;mso-position-horizontal-relative:text;mso-position-vertical:absolute;mso-position-vertical-relative:text;mso-width-percent:0;mso-height-percent:0;mso-width-relative:margin;mso-height-relative:margin;v-text-anchor:middle" arcsize="10923f" o:gfxdata="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" fillcolor="window" strokecolor="red" strokeweight="1pt">
                 <v:stroke joinstyle="miter"/>
@@ -6634,7 +6630,7 @@
               </wp:anchor>
             </w:drawing>
           </mc:Choice>
-          <mc:Fallback xmlns:w16du="http://schemas.microsoft.com/office/word/2023/wordml/word16du" xmlns:w16sdtfl="http://schemas.microsoft.com/office/word/2024/wordml/sdtformatlock">
+          <mc:Fallback>
             <w:pict>
               <v:roundrect w14:anchorId="793ADB61" id="Stačiakampis: suapvalinti kampai 10" o:spid="_x0000_s1044" style="position:absolute;left:0;text-align:left;margin-left:14.1pt;margin-top:1pt;width:138.7pt;height:74.75pt;z-index:251678720;visibility:visible;mso-wrap-style:square;mso-width-percent:0;mso-height-percent:0;mso-wrap-distance-left:9pt;mso-wrap-distance-top:0;mso-wrap-distance-right:9pt;mso-wrap-distance-bottom:0;mso-position-horizontal:absolute;mso-position-horizontal-relative:text;mso-position-vertical:absolute;mso-position-vertical-relative:text;mso-width-percent:0;mso-height-percent:0;mso-width-relative:margin;mso-height-relative:margin;v-text-anchor:middle" arcsize="10923f" o:gfxdata="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" fillcolor="window" strokecolor="red" strokeweight="1pt">
                 <v:stroke joinstyle="miter"/>
@@ -6751,7 +6747,7 @@
               </wp:anchor>
             </w:drawing>
           </mc:Choice>
-          <mc:Fallback xmlns:w16du="http://schemas.microsoft.com/office/word/2023/wordml/word16du" xmlns:w16sdtfl="http://schemas.microsoft.com/office/word/2024/wordml/sdtformatlock">
+          <mc:Fallback>
             <w:pict>
               <v:shapetype w14:anchorId="291AF6EE" id="_x0000_t13" coordsize="21600,21600" o:spt="13" adj="16200,5400" path="m@0,l@0@1,0@1,0@2@0@2@0,21600,21600,10800xe">
                 <v:stroke joinstyle="miter"/>
@@ -6903,7 +6899,7 @@
               </wp:anchor>
             </w:drawing>
           </mc:Choice>
-          <mc:Fallback xmlns:w16du="http://schemas.microsoft.com/office/word/2023/wordml/word16du" xmlns:w16sdtfl="http://schemas.microsoft.com/office/word/2024/wordml/sdtformatlock">
+          <mc:Fallback>
             <w:pict>
               <v:oval w14:anchorId="3EABAA81" id="Ovalas 8" o:spid="_x0000_s1045" style="position:absolute;left:0;text-align:left;margin-left:181.1pt;margin-top:6.15pt;width:108pt;height:108.75pt;z-index:251675648;visibility:visible;mso-wrap-style:square;mso-width-percent:0;mso-height-percent:0;mso-wrap-distance-left:9pt;mso-wrap-distance-top:0;mso-wrap-distance-right:9pt;mso-wrap-distance-bottom:0;mso-position-horizontal:absolute;mso-position-horizontal-relative:text;mso-position-vertical:absolute;mso-position-vertical-relative:text;mso-width-percent:0;mso-height-percent:0;mso-width-relative:margin;mso-height-relative:margin;v-text-anchor:middle" o:gfxdata="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" fillcolor="window" strokecolor="red" strokeweight="1pt">
                 <v:stroke joinstyle="miter"/>
@@ -7044,7 +7040,7 @@
               </wp:anchor>
             </w:drawing>
           </mc:Choice>
-          <mc:Fallback xmlns:w16du="http://schemas.microsoft.com/office/word/2023/wordml/word16du" xmlns:w16sdtfl="http://schemas.microsoft.com/office/word/2024/wordml/sdtformatlock">
+          <mc:Fallback>
             <w:pict>
               <v:shapetype w14:anchorId="080465F1" id="_x0000_t13" coordsize="21600,21600" o:spt="13" adj="16200,5400" path="m@0,l@0@1,0@1,0@2@0@2@0,21600,21600,10800xe">
                 <v:stroke joinstyle="miter"/>
@@ -7175,7 +7171,7 @@
               </wp:anchor>
             </w:drawing>
           </mc:Choice>
-          <mc:Fallback xmlns:w16du="http://schemas.microsoft.com/office/word/2023/wordml/word16du" xmlns:w16sdtfl="http://schemas.microsoft.com/office/word/2024/wordml/sdtformatlock">
+          <mc:Fallback>
             <w:pict>
               <v:roundrect w14:anchorId="32B59331" id="_x0000_s1046" style="position:absolute;left:0;text-align:left;margin-left:-6pt;margin-top:19.4pt;width:152.65pt;height:70.6pt;z-index:251677696;visibility:visible;mso-wrap-style:square;mso-width-percent:0;mso-height-percent:0;mso-wrap-distance-left:9pt;mso-wrap-distance-top:0;mso-wrap-distance-right:9pt;mso-wrap-distance-bottom:0;mso-position-horizontal:absolute;mso-position-horizontal-relative:text;mso-position-vertical:absolute;mso-position-vertical-relative:text;mso-width-percent:0;mso-height-percent:0;mso-width-relative:margin;mso-height-relative:margin;v-text-anchor:middle" arcsize="10923f" o:gfxdata="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" fillcolor="window" strokecolor="red" strokeweight="1pt">
                 <v:stroke joinstyle="miter"/>
@@ -7300,7 +7296,7 @@
               </wp:anchor>
             </w:drawing>
           </mc:Choice>
-          <mc:Fallback xmlns:w16du="http://schemas.microsoft.com/office/word/2023/wordml/word16du" xmlns:w16sdtfl="http://schemas.microsoft.com/office/word/2024/wordml/sdtformatlock">
+          <mc:Fallback>
             <w:pict>
               <v:shape w14:anchorId="58F4A1A1" id="Rodyklė: dešinėn 4" o:spid="_x0000_s1026" type="#_x0000_t13" style="position:absolute;margin-left:151.65pt;margin-top:.5pt;width:28.3pt;height:28.3pt;rotation:-366395fd;z-index:251672576;visibility:visible;mso-wrap-style:square;mso-width-percent:0;mso-height-percent:0;mso-wrap-distance-left:9pt;mso-wrap-distance-top:0;mso-wrap-distance-right:9pt;mso-wrap-distance-bottom:0;mso-position-horizontal:absolute;mso-position-horizontal-relative:text;mso-position-vertical:absolute;mso-position-vertical-relative:text;mso-width-percent:0;mso-height-percent:0;mso-width-relative:margin;mso-height-relative:margin;v-text-anchor:middle" o:gfxdata="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" adj="10800" fillcolor="window" strokecolor="windowText" strokeweight="2.25pt"/>
             </w:pict>
@@ -19387,6 +19383,7 @@
         <w:t xml:space="preserve">, </w:t>
       </w:r>
       <w:proofErr w:type="spellStart"/>
+      <w:proofErr w:type="gramStart"/>
       <w:r>
         <w:rPr>
           <w:lang w:val="en-US"/>
@@ -19400,6 +19397,7 @@
         </w:rPr>
         <w:t>;</w:t>
       </w:r>
+      <w:proofErr w:type="gramEnd"/>
     </w:p>
     <w:p>
       <w:pPr>
@@ -26930,7 +26928,7 @@
 </file>
 
 <file path=word/endnotes.xml><?xml version="1.0" encoding="utf-8"?>
-<w:endnotes xmlns:wpc="http://schemas.microsoft.com/office/word/2010/wordprocessingCanvas" xmlns:cx="http://schemas.microsoft.com/office/drawing/2014/chartex" xmlns:cx1="http://schemas.microsoft.com/office/drawing/2015/9/8/chartex" xmlns:cx2="http://schemas.microsoft.com/office/drawing/2015/10/21/chartex" xmlns:cx3="http://schemas.microsoft.com/office/drawing/2016/5/9/chartex" xmlns:cx4="http://schemas.microsoft.com/office/drawing/2016/5/10/chartex" xmlns:cx5="http://schemas.microsoft.com/office/drawing/2016/5/11/chartex" xmlns:cx6="http://schemas.microsoft.com/office/drawing/2016/5/12/chartex" xmlns:cx7="http://schemas.microsoft.com/office/drawing/2016/5/13/chartex" xmlns:cx8="http://schemas.microsoft.com/office/drawing/2016/5/14/chartex" xmlns:mc="http://schemas.openxmlformats.org/markup-compatibility/2006" xmlns:aink="http://schemas.microsoft.com/office/drawing/2016/ink" xmlns:am3d="http://schemas.microsoft.com/office/drawing/2017/model3d" xmlns:o="urn:schemas-microsoft-com:office:office" xmlns:oel="http://schemas.microsoft.com/office/2019/extlst" xmlns:r="http://schemas.openxmlformats.org/officeDocument/2006/relationships" xmlns:m="http://schemas.openxmlformats.org/officeDocument/2006/math" xmlns:v="urn:schemas-microsoft-com:vml" xmlns:wp14="http://schemas.microsoft.com/office/word/2010/wordprocessingDrawing" xmlns:wp="http://schemas.openxmlformats.org/drawingml/2006/wordprocessingDrawing" xmlns:w10="urn:schemas-microsoft-com:office:word" xmlns:w="http://schemas.openxmlformats.org/wordprocessingml/2006/main" xmlns:w14="http://schemas.microsoft.com/office/word/2010/wordml" xmlns:w15="http://schemas.microsoft.com/office/word/2012/wordml" xmlns:w16cex="http://schemas.microsoft.com/office/word/2018/wordml/cex" xmlns:w16cid="http://schemas.microsoft.com/office/word/2016/wordml/cid" xmlns:w16="http://schemas.microsoft.com/office/word/2018/wordml" xmlns:w16sdtdh="http://schemas.microsoft.com/office/word/2020/wordml/sdtdatahash" xmlns:w16se="http://schemas.microsoft.com/office/word/2015/wordml/symex" xmlns:wpg="http://schemas.microsoft.com/office/word/2010/wordprocessingGroup" xmlns:wpi="http://schemas.microsoft.com/office/word/2010/wordprocessingInk" xmlns:wne="http://schemas.microsoft.com/office/word/2006/wordml" xmlns:wps="http://schemas.microsoft.com/office/word/2010/wordprocessingShape" mc:Ignorable="w14 w15 w16se w16cid w16 w16cex w16sdtdh wp14">
+<w:endnotes xmlns:wpc="http://schemas.microsoft.com/office/word/2010/wordprocessingCanvas" xmlns:cx="http://schemas.microsoft.com/office/drawing/2014/chartex" xmlns:cx1="http://schemas.microsoft.com/office/drawing/2015/9/8/chartex" xmlns:cx2="http://schemas.microsoft.com/office/drawing/2015/10/21/chartex" xmlns:cx3="http://schemas.microsoft.com/office/drawing/2016/5/9/chartex" xmlns:cx4="http://schemas.microsoft.com/office/drawing/2016/5/10/chartex" xmlns:cx5="http://schemas.microsoft.com/office/drawing/2016/5/11/chartex" xmlns:cx6="http://schemas.microsoft.com/office/drawing/2016/5/12/chartex" xmlns:cx7="http://schemas.microsoft.com/office/drawing/2016/5/13/chartex" xmlns:cx8="http://schemas.microsoft.com/office/drawing/2016/5/14/chartex" xmlns:mc="http://schemas.openxmlformats.org/markup-compatibility/2006" xmlns:aink="http://schemas.microsoft.com/office/drawing/2016/ink" xmlns:am3d="http://schemas.microsoft.com/office/drawing/2017/model3d" xmlns:o="urn:schemas-microsoft-com:office:office" xmlns:oel="http://schemas.microsoft.com/office/2019/extlst" xmlns:r="http://schemas.openxmlformats.org/officeDocument/2006/relationships" xmlns:m="http://schemas.openxmlformats.org/officeDocument/2006/math" xmlns:v="urn:schemas-microsoft-com:vml" xmlns:wp14="http://schemas.microsoft.com/office/word/2010/wordprocessingDrawing" xmlns:wp="http://schemas.openxmlformats.org/drawingml/2006/wordprocessingDrawing" xmlns:w10="urn:schemas-microsoft-com:office:word" xmlns:w="http://schemas.openxmlformats.org/wordprocessingml/2006/main" xmlns:w14="http://schemas.microsoft.com/office/word/2010/wordml" xmlns:w15="http://schemas.microsoft.com/office/word/2012/wordml" xmlns:w16cex="http://schemas.microsoft.com/office/word/2018/wordml/cex" xmlns:w16cid="http://schemas.microsoft.com/office/word/2016/wordml/cid" xmlns:w16="http://schemas.microsoft.com/office/word/2018/wordml" xmlns:w16du="http://schemas.microsoft.com/office/word/2023/wordml/word16du" xmlns:w16sdtdh="http://schemas.microsoft.com/office/word/2020/wordml/sdtdatahash" xmlns:w16sdtfl="http://schemas.microsoft.com/office/word/2024/wordml/sdtformatlock" xmlns:w16se="http://schemas.microsoft.com/office/word/2015/wordml/symex" xmlns:wpg="http://schemas.microsoft.com/office/word/2010/wordprocessingGroup" xmlns:wpi="http://schemas.microsoft.com/office/word/2010/wordprocessingInk" xmlns:wne="http://schemas.microsoft.com/office/word/2006/wordml" xmlns:wps="http://schemas.microsoft.com/office/word/2010/wordprocessingShape" mc:Ignorable="w14 w15 w16se w16cid w16 w16cex w16sdtdh w16sdtfl w16du wp14">
   <w:endnote w:type="separator" w:id="-1">
     <w:p>
       <w:pPr>
@@ -26955,7 +26953,7 @@
 </file>
 
 <file path=word/footer1.xml><?xml version="1.0" encoding="utf-8"?>
-<w:ftr xmlns:wpc="http://schemas.microsoft.com/office/word/2010/wordprocessingCanvas" xmlns:cx="http://schemas.microsoft.com/office/drawing/2014/chartex" xmlns:cx1="http://schemas.microsoft.com/office/drawing/2015/9/8/chartex" xmlns:cx2="http://schemas.microsoft.com/office/drawing/2015/10/21/chartex" xmlns:cx3="http://schemas.microsoft.com/office/drawing/2016/5/9/chartex" xmlns:cx4="http://schemas.microsoft.com/office/drawing/2016/5/10/chartex" xmlns:cx5="http://schemas.microsoft.com/office/drawing/2016/5/11/chartex" xmlns:cx6="http://schemas.microsoft.com/office/drawing/2016/5/12/chartex" xmlns:cx7="http://schemas.microsoft.com/office/drawing/2016/5/13/chartex" xmlns:cx8="http://schemas.microsoft.com/office/drawing/2016/5/14/chartex" xmlns:mc="http://schemas.openxmlformats.org/markup-compatibility/2006" xmlns:aink="http://schemas.microsoft.com/office/drawing/2016/ink" xmlns:am3d="http://schemas.microsoft.com/office/drawing/2017/model3d" xmlns:o="urn:schemas-microsoft-com:office:office" xmlns:oel="http://schemas.microsoft.com/office/2019/extlst" xmlns:r="http://schemas.openxmlformats.org/officeDocument/2006/relationships" xmlns:m="http://schemas.openxmlformats.org/officeDocument/2006/math" xmlns:v="urn:schemas-microsoft-com:vml" xmlns:wp14="http://schemas.microsoft.com/office/word/2010/wordprocessingDrawing" xmlns:wp="http://schemas.openxmlformats.org/drawingml/2006/wordprocessingDrawing" xmlns:w10="urn:schemas-microsoft-com:office:word" xmlns:w="http://schemas.openxmlformats.org/wordprocessingml/2006/main" xmlns:w14="http://schemas.microsoft.com/office/word/2010/wordml" xmlns:w15="http://schemas.microsoft.com/office/word/2012/wordml" xmlns:w16cex="http://schemas.microsoft.com/office/word/2018/wordml/cex" xmlns:w16cid="http://schemas.microsoft.com/office/word/2016/wordml/cid" xmlns:w16="http://schemas.microsoft.com/office/word/2018/wordml" xmlns:w16sdtdh="http://schemas.microsoft.com/office/word/2020/wordml/sdtdatahash" xmlns:w16se="http://schemas.microsoft.com/office/word/2015/wordml/symex" xmlns:wpg="http://schemas.microsoft.com/office/word/2010/wordprocessingGroup" xmlns:wpi="http://schemas.microsoft.com/office/word/2010/wordprocessingInk" xmlns:wne="http://schemas.microsoft.com/office/word/2006/wordml" xmlns:wps="http://schemas.microsoft.com/office/word/2010/wordprocessingShape" mc:Ignorable="w14 w15 w16se w16cid w16 w16cex w16sdtdh wp14">
+<w:ftr xmlns:wpc="http://schemas.microsoft.com/office/word/2010/wordprocessingCanvas" xmlns:cx="http://schemas.microsoft.com/office/drawing/2014/chartex" xmlns:cx1="http://schemas.microsoft.com/office/drawing/2015/9/8/chartex" xmlns:cx2="http://schemas.microsoft.com/office/drawing/2015/10/21/chartex" xmlns:cx3="http://schemas.microsoft.com/office/drawing/2016/5/9/chartex" xmlns:cx4="http://schemas.microsoft.com/office/drawing/2016/5/10/chartex" xmlns:cx5="http://schemas.microsoft.com/office/drawing/2016/5/11/chartex" xmlns:cx6="http://schemas.microsoft.com/office/drawing/2016/5/12/chartex" xmlns:cx7="http://schemas.microsoft.com/office/drawing/2016/5/13/chartex" xmlns:cx8="http://schemas.microsoft.com/office/drawing/2016/5/14/chartex" xmlns:mc="http://schemas.openxmlformats.org/markup-compatibility/2006" xmlns:aink="http://schemas.microsoft.com/office/drawing/2016/ink" xmlns:am3d="http://schemas.microsoft.com/office/drawing/2017/model3d" xmlns:o="urn:schemas-microsoft-com:office:office" xmlns:oel="http://schemas.microsoft.com/office/2019/extlst" xmlns:r="http://schemas.openxmlformats.org/officeDocument/2006/relationships" xmlns:m="http://schemas.openxmlformats.org/officeDocument/2006/math" xmlns:v="urn:schemas-microsoft-com:vml" xmlns:wp14="http://schemas.microsoft.com/office/word/2010/wordprocessingDrawing" xmlns:wp="http://schemas.openxmlformats.org/drawingml/2006/wordprocessingDrawing" xmlns:w10="urn:schemas-microsoft-com:office:word" xmlns:w="http://schemas.openxmlformats.org/wordprocessingml/2006/main" xmlns:w14="http://schemas.microsoft.com/office/word/2010/wordml" xmlns:w15="http://schemas.microsoft.com/office/word/2012/wordml" xmlns:w16cex="http://schemas.microsoft.com/office/word/2018/wordml/cex" xmlns:w16cid="http://schemas.microsoft.com/office/word/2016/wordml/cid" xmlns:w16="http://schemas.microsoft.com/office/word/2018/wordml" xmlns:w16du="http://schemas.microsoft.com/office/word/2023/wordml/word16du" xmlns:w16sdtdh="http://schemas.microsoft.com/office/word/2020/wordml/sdtdatahash" xmlns:w16sdtfl="http://schemas.microsoft.com/office/word/2024/wordml/sdtformatlock" xmlns:w16se="http://schemas.microsoft.com/office/word/2015/wordml/symex" xmlns:wpg="http://schemas.microsoft.com/office/word/2010/wordprocessingGroup" xmlns:wpi="http://schemas.microsoft.com/office/word/2010/wordprocessingInk" xmlns:wne="http://schemas.microsoft.com/office/word/2006/wordml" xmlns:wps="http://schemas.microsoft.com/office/word/2010/wordprocessingShape" mc:Ignorable="w14 w15 w16se w16cid w16 w16cex w16sdtdh w16sdtfl w16du wp14">
   <w:p>
     <w:pPr>
       <w:pStyle w:val="Footer"/>
@@ -26965,7 +26963,7 @@
 </file>
 
 <file path=word/footer2.xml><?xml version="1.0" encoding="utf-8"?>
-<w:ftr xmlns:wpc="http://schemas.microsoft.com/office/word/2010/wordprocessingCanvas" xmlns:cx="http://schemas.microsoft.com/office/drawing/2014/chartex" xmlns:cx1="http://schemas.microsoft.com/office/drawing/2015/9/8/chartex" xmlns:cx2="http://schemas.microsoft.com/office/drawing/2015/10/21/chartex" xmlns:cx3="http://schemas.microsoft.com/office/drawing/2016/5/9/chartex" xmlns:cx4="http://schemas.microsoft.com/office/drawing/2016/5/10/chartex" xmlns:cx5="http://schemas.microsoft.com/office/drawing/2016/5/11/chartex" xmlns:cx6="http://schemas.microsoft.com/office/drawing/2016/5/12/chartex" xmlns:cx7="http://schemas.microsoft.com/office/drawing/2016/5/13/chartex" xmlns:cx8="http://schemas.microsoft.com/office/drawing/2016/5/14/chartex" xmlns:mc="http://schemas.openxmlformats.org/markup-compatibility/2006" xmlns:aink="http://schemas.microsoft.com/office/drawing/2016/ink" xmlns:am3d="http://schemas.microsoft.com/office/drawing/2017/model3d" xmlns:o="urn:schemas-microsoft-com:office:office" xmlns:oel="http://schemas.microsoft.com/office/2019/extlst" xmlns:r="http://schemas.openxmlformats.org/officeDocument/2006/relationships" xmlns:m="http://schemas.openxmlformats.org/officeDocument/2006/math" xmlns:v="urn:schemas-microsoft-com:vml" xmlns:wp14="http://schemas.microsoft.com/office/word/2010/wordprocessingDrawing" xmlns:wp="http://schemas.openxmlformats.org/drawingml/2006/wordprocessingDrawing" xmlns:w10="urn:schemas-microsoft-com:office:word" xmlns:w="http://schemas.openxmlformats.org/wordprocessingml/2006/main" xmlns:w14="http://schemas.microsoft.com/office/word/2010/wordml" xmlns:w15="http://schemas.microsoft.com/office/word/2012/wordml" xmlns:w16cex="http://schemas.microsoft.com/office/word/2018/wordml/cex" xmlns:w16cid="http://schemas.microsoft.com/office/word/2016/wordml/cid" xmlns:w16="http://schemas.microsoft.com/office/word/2018/wordml" xmlns:w16sdtdh="http://schemas.microsoft.com/office/word/2020/wordml/sdtdatahash" xmlns:w16se="http://schemas.microsoft.com/office/word/2015/wordml/symex" xmlns:wpg="http://schemas.microsoft.com/office/word/2010/wordprocessingGroup" xmlns:wpi="http://schemas.microsoft.com/office/word/2010/wordprocessingInk" xmlns:wne="http://schemas.microsoft.com/office/word/2006/wordml" xmlns:wps="http://schemas.microsoft.com/office/word/2010/wordprocessingShape" mc:Ignorable="w14 w15 w16se w16cid w16 w16cex w16sdtdh wp14">
+<w:ftr xmlns:wpc="http://schemas.microsoft.com/office/word/2010/wordprocessingCanvas" xmlns:cx="http://schemas.microsoft.com/office/drawing/2014/chartex" xmlns:cx1="http://schemas.microsoft.com/office/drawing/2015/9/8/chartex" xmlns:cx2="http://schemas.microsoft.com/office/drawing/2015/10/21/chartex" xmlns:cx3="http://schemas.microsoft.com/office/drawing/2016/5/9/chartex" xmlns:cx4="http://schemas.microsoft.com/office/drawing/2016/5/10/chartex" xmlns:cx5="http://schemas.microsoft.com/office/drawing/2016/5/11/chartex" xmlns:cx6="http://schemas.microsoft.com/office/drawing/2016/5/12/chartex" xmlns:cx7="http://schemas.microsoft.com/office/drawing/2016/5/13/chartex" xmlns:cx8="http://schemas.microsoft.com/office/drawing/2016/5/14/chartex" xmlns:mc="http://schemas.openxmlformats.org/markup-compatibility/2006" xmlns:aink="http://schemas.microsoft.com/office/drawing/2016/ink" xmlns:am3d="http://schemas.microsoft.com/office/drawing/2017/model3d" xmlns:o="urn:schemas-microsoft-com:office:office" xmlns:oel="http://schemas.microsoft.com/office/2019/extlst" xmlns:r="http://schemas.openxmlformats.org/officeDocument/2006/relationships" xmlns:m="http://schemas.openxmlformats.org/officeDocument/2006/math" xmlns:v="urn:schemas-microsoft-com:vml" xmlns:wp14="http://schemas.microsoft.com/office/word/2010/wordprocessingDrawing" xmlns:wp="http://schemas.openxmlformats.org/drawingml/2006/wordprocessingDrawing" xmlns:w10="urn:schemas-microsoft-com:office:word" xmlns:w="http://schemas.openxmlformats.org/wordprocessingml/2006/main" xmlns:w14="http://schemas.microsoft.com/office/word/2010/wordml" xmlns:w15="http://schemas.microsoft.com/office/word/2012/wordml" xmlns:w16cex="http://schemas.microsoft.com/office/word/2018/wordml/cex" xmlns:w16cid="http://schemas.microsoft.com/office/word/2016/wordml/cid" xmlns:w16="http://schemas.microsoft.com/office/word/2018/wordml" xmlns:w16du="http://schemas.microsoft.com/office/word/2023/wordml/word16du" xmlns:w16sdtdh="http://schemas.microsoft.com/office/word/2020/wordml/sdtdatahash" xmlns:w16sdtfl="http://schemas.microsoft.com/office/word/2024/wordml/sdtformatlock" xmlns:w16se="http://schemas.microsoft.com/office/word/2015/wordml/symex" xmlns:wpg="http://schemas.microsoft.com/office/word/2010/wordprocessingGroup" xmlns:wpi="http://schemas.microsoft.com/office/word/2010/wordprocessingInk" xmlns:wne="http://schemas.microsoft.com/office/word/2006/wordml" xmlns:wps="http://schemas.microsoft.com/office/word/2010/wordprocessingShape" mc:Ignorable="w14 w15 w16se w16cid w16 w16cex w16sdtdh w16sdtfl w16du wp14">
   <w:p>
     <w:pPr>
       <w:pStyle w:val="Footer"/>
@@ -26975,7 +26973,7 @@
 </file>
 
 <file path=word/footer3.xml><?xml version="1.0" encoding="utf-8"?>
-<w:ftr xmlns:wpc="http://schemas.microsoft.com/office/word/2010/wordprocessingCanvas" xmlns:cx="http://schemas.microsoft.com/office/drawing/2014/chartex" xmlns:cx1="http://schemas.microsoft.com/office/drawing/2015/9/8/chartex" xmlns:cx2="http://schemas.microsoft.com/office/drawing/2015/10/21/chartex" xmlns:cx3="http://schemas.microsoft.com/office/drawing/2016/5/9/chartex" xmlns:cx4="http://schemas.microsoft.com/office/drawing/2016/5/10/chartex" xmlns:cx5="http://schemas.microsoft.com/office/drawing/2016/5/11/chartex" xmlns:cx6="http://schemas.microsoft.com/office/drawing/2016/5/12/chartex" xmlns:cx7="http://schemas.microsoft.com/office/drawing/2016/5/13/chartex" xmlns:cx8="http://schemas.microsoft.com/office/drawing/2016/5/14/chartex" xmlns:mc="http://schemas.openxmlformats.org/markup-compatibility/2006" xmlns:aink="http://schemas.microsoft.com/office/drawing/2016/ink" xmlns:am3d="http://schemas.microsoft.com/office/drawing/2017/model3d" xmlns:o="urn:schemas-microsoft-com:office:office" xmlns:oel="http://schemas.microsoft.com/office/2019/extlst" xmlns:r="http://schemas.openxmlformats.org/officeDocument/2006/relationships" xmlns:m="http://schemas.openxmlformats.org/officeDocument/2006/math" xmlns:v="urn:schemas-microsoft-com:vml" xmlns:wp14="http://schemas.microsoft.com/office/word/2010/wordprocessingDrawing" xmlns:wp="http://schemas.openxmlformats.org/drawingml/2006/wordprocessingDrawing" xmlns:w10="urn:schemas-microsoft-com:office:word" xmlns:w="http://schemas.openxmlformats.org/wordprocessingml/2006/main" xmlns:w14="http://schemas.microsoft.com/office/word/2010/wordml" xmlns:w15="http://schemas.microsoft.com/office/word/2012/wordml" xmlns:w16cex="http://schemas.microsoft.com/office/word/2018/wordml/cex" xmlns:w16cid="http://schemas.microsoft.com/office/word/2016/wordml/cid" xmlns:w16="http://schemas.microsoft.com/office/word/2018/wordml" xmlns:w16sdtdh="http://schemas.microsoft.com/office/word/2020/wordml/sdtdatahash" xmlns:w16se="http://schemas.microsoft.com/office/word/2015/wordml/symex" xmlns:wpg="http://schemas.microsoft.com/office/word/2010/wordprocessingGroup" xmlns:wpi="http://schemas.microsoft.com/office/word/2010/wordprocessingInk" xmlns:wne="http://schemas.microsoft.com/office/word/2006/wordml" xmlns:wps="http://schemas.microsoft.com/office/word/2010/wordprocessingShape" mc:Ignorable="w14 w15 w16se w16cid w16 w16cex w16sdtdh wp14">
+<w:ftr xmlns:wpc="http://schemas.microsoft.com/office/word/2010/wordprocessingCanvas" xmlns:cx="http://schemas.microsoft.com/office/drawing/2014/chartex" xmlns:cx1="http://schemas.microsoft.com/office/drawing/2015/9/8/chartex" xmlns:cx2="http://schemas.microsoft.com/office/drawing/2015/10/21/chartex" xmlns:cx3="http://schemas.microsoft.com/office/drawing/2016/5/9/chartex" xmlns:cx4="http://schemas.microsoft.com/office/drawing/2016/5/10/chartex" xmlns:cx5="http://schemas.microsoft.com/office/drawing/2016/5/11/chartex" xmlns:cx6="http://schemas.microsoft.com/office/drawing/2016/5/12/chartex" xmlns:cx7="http://schemas.microsoft.com/office/drawing/2016/5/13/chartex" xmlns:cx8="http://schemas.microsoft.com/office/drawing/2016/5/14/chartex" xmlns:mc="http://schemas.openxmlformats.org/markup-compatibility/2006" xmlns:aink="http://schemas.microsoft.com/office/drawing/2016/ink" xmlns:am3d="http://schemas.microsoft.com/office/drawing/2017/model3d" xmlns:o="urn:schemas-microsoft-com:office:office" xmlns:oel="http://schemas.microsoft.com/office/2019/extlst" xmlns:r="http://schemas.openxmlformats.org/officeDocument/2006/relationships" xmlns:m="http://schemas.openxmlformats.org/officeDocument/2006/math" xmlns:v="urn:schemas-microsoft-com:vml" xmlns:wp14="http://schemas.microsoft.com/office/word/2010/wordprocessingDrawing" xmlns:wp="http://schemas.openxmlformats.org/drawingml/2006/wordprocessingDrawing" xmlns:w10="urn:schemas-microsoft-com:office:word" xmlns:w="http://schemas.openxmlformats.org/wordprocessingml/2006/main" xmlns:w14="http://schemas.microsoft.com/office/word/2010/wordml" xmlns:w15="http://schemas.microsoft.com/office/word/2012/wordml" xmlns:w16cex="http://schemas.microsoft.com/office/word/2018/wordml/cex" xmlns:w16cid="http://schemas.microsoft.com/office/word/2016/wordml/cid" xmlns:w16="http://schemas.microsoft.com/office/word/2018/wordml" xmlns:w16du="http://schemas.microsoft.com/office/word/2023/wordml/word16du" xmlns:w16sdtdh="http://schemas.microsoft.com/office/word/2020/wordml/sdtdatahash" xmlns:w16sdtfl="http://schemas.microsoft.com/office/word/2024/wordml/sdtformatlock" xmlns:w16se="http://schemas.microsoft.com/office/word/2015/wordml/symex" xmlns:wpg="http://schemas.microsoft.com/office/word/2010/wordprocessingGroup" xmlns:wpi="http://schemas.microsoft.com/office/word/2010/wordprocessingInk" xmlns:wne="http://schemas.microsoft.com/office/word/2006/wordml" xmlns:wps="http://schemas.microsoft.com/office/word/2010/wordprocessingShape" mc:Ignorable="w14 w15 w16se w16cid w16 w16cex w16sdtdh w16sdtfl w16du wp14">
   <w:p>
     <w:pPr>
       <w:pStyle w:val="Footer"/>
@@ -26985,7 +26983,7 @@
 </file>
 
 <file path=word/footnotes.xml><?xml version="1.0" encoding="utf-8"?>
-<w:footnotes xmlns:wpc="http://schemas.microsoft.com/office/word/2010/wordprocessingCanvas" xmlns:cx="http://schemas.microsoft.com/office/drawing/2014/chartex" xmlns:cx1="http://schemas.microsoft.com/office/drawing/2015/9/8/chartex" xmlns:cx2="http://schemas.microsoft.com/office/drawing/2015/10/21/chartex" xmlns:cx3="http://schemas.microsoft.com/office/drawing/2016/5/9/chartex" xmlns:cx4="http://schemas.microsoft.com/office/drawing/2016/5/10/chartex" xmlns:cx5="http://schemas.microsoft.com/office/drawing/2016/5/11/chartex" xmlns:cx6="http://schemas.microsoft.com/office/drawing/2016/5/12/chartex" xmlns:cx7="http://schemas.microsoft.com/office/drawing/2016/5/13/chartex" xmlns:cx8="http://schemas.microsoft.com/office/drawing/2016/5/14/chartex" xmlns:mc="http://schemas.openxmlformats.org/markup-compatibility/2006" xmlns:aink="http://schemas.microsoft.com/office/drawing/2016/ink" xmlns:am3d="http://schemas.microsoft.com/office/drawing/2017/model3d" xmlns:o="urn:schemas-microsoft-com:office:office" xmlns:oel="http://schemas.microsoft.com/office/2019/extlst" xmlns:r="http://schemas.openxmlformats.org/officeDocument/2006/relationships" xmlns:m="http://schemas.openxmlformats.org/officeDocument/2006/math" xmlns:v="urn:schemas-microsoft-com:vml" xmlns:wp14="http://schemas.microsoft.com/office/word/2010/wordprocessingDrawing" xmlns:wp="http://schemas.openxmlformats.org/drawingml/2006/wordprocessingDrawing" xmlns:w10="urn:schemas-microsoft-com:office:word" xmlns:w="http://schemas.openxmlformats.org/wordprocessingml/2006/main" xmlns:w14="http://schemas.microsoft.com/office/word/2010/wordml" xmlns:w15="http://schemas.microsoft.com/office/word/2012/wordml" xmlns:w16cex="http://schemas.microsoft.com/office/word/2018/wordml/cex" xmlns:w16cid="http://schemas.microsoft.com/office/word/2016/wordml/cid" xmlns:w16="http://schemas.microsoft.com/office/word/2018/wordml" xmlns:w16sdtdh="http://schemas.microsoft.com/office/word/2020/wordml/sdtdatahash" xmlns:w16se="http://schemas.microsoft.com/office/word/2015/wordml/symex" xmlns:wpg="http://schemas.microsoft.com/office/word/2010/wordprocessingGroup" xmlns:wpi="http://schemas.microsoft.com/office/word/2010/wordprocessingInk" xmlns:wne="http://schemas.microsoft.com/office/word/2006/wordml" xmlns:wps="http://schemas.microsoft.com/office/word/2010/wordprocessingShape" mc:Ignorable="w14 w15 w16se w16cid w16 w16cex w16sdtdh wp14">
+<w:footnotes xmlns:wpc="http://schemas.microsoft.com/office/word/2010/wordprocessingCanvas" xmlns:cx="http://schemas.microsoft.com/office/drawing/2014/chartex" xmlns:cx1="http://schemas.microsoft.com/office/drawing/2015/9/8/chartex" xmlns:cx2="http://schemas.microsoft.com/office/drawing/2015/10/21/chartex" xmlns:cx3="http://schemas.microsoft.com/office/drawing/2016/5/9/chartex" xmlns:cx4="http://schemas.microsoft.com/office/drawing/2016/5/10/chartex" xmlns:cx5="http://schemas.microsoft.com/office/drawing/2016/5/11/chartex" xmlns:cx6="http://schemas.microsoft.com/office/drawing/2016/5/12/chartex" xmlns:cx7="http://schemas.microsoft.com/office/drawing/2016/5/13/chartex" xmlns:cx8="http://schemas.microsoft.com/office/drawing/2016/5/14/chartex" xmlns:mc="http://schemas.openxmlformats.org/markup-compatibility/2006" xmlns:aink="http://schemas.microsoft.com/office/drawing/2016/ink" xmlns:am3d="http://schemas.microsoft.com/office/drawing/2017/model3d" xmlns:o="urn:schemas-microsoft-com:office:office" xmlns:oel="http://schemas.microsoft.com/office/2019/extlst" xmlns:r="http://schemas.openxmlformats.org/officeDocument/2006/relationships" xmlns:m="http://schemas.openxmlformats.org/officeDocument/2006/math" xmlns:v="urn:schemas-microsoft-com:vml" xmlns:wp14="http://schemas.microsoft.com/office/word/2010/wordprocessingDrawing" xmlns:wp="http://schemas.openxmlformats.org/drawingml/2006/wordprocessingDrawing" xmlns:w10="urn:schemas-microsoft-com:office:word" xmlns:w="http://schemas.openxmlformats.org/wordprocessingml/2006/main" xmlns:w14="http://schemas.microsoft.com/office/word/2010/wordml" xmlns:w15="http://schemas.microsoft.com/office/word/2012/wordml" xmlns:w16cex="http://schemas.microsoft.com/office/word/2018/wordml/cex" xmlns:w16cid="http://schemas.microsoft.com/office/word/2016/wordml/cid" xmlns:w16="http://schemas.microsoft.com/office/word/2018/wordml" xmlns:w16du="http://schemas.microsoft.com/office/word/2023/wordml/word16du" xmlns:w16sdtdh="http://schemas.microsoft.com/office/word/2020/wordml/sdtdatahash" xmlns:w16sdtfl="http://schemas.microsoft.com/office/word/2024/wordml/sdtformatlock" xmlns:w16se="http://schemas.microsoft.com/office/word/2015/wordml/symex" xmlns:wpg="http://schemas.microsoft.com/office/word/2010/wordprocessingGroup" xmlns:wpi="http://schemas.microsoft.com/office/word/2010/wordprocessingInk" xmlns:wne="http://schemas.microsoft.com/office/word/2006/wordml" xmlns:wps="http://schemas.microsoft.com/office/word/2010/wordprocessingShape" mc:Ignorable="w14 w15 w16se w16cid w16 w16cex w16sdtdh w16sdtfl w16du wp14">
   <w:footnote w:type="separator" w:id="-1">
     <w:p>
       <w:pPr>
@@ -27013,7 +27011,7 @@
 </file>
 
 <file path=word/header1.xml><?xml version="1.0" encoding="utf-8"?>
-<w:hdr xmlns:wpc="http://schemas.microsoft.com/office/word/2010/wordprocessingCanvas" xmlns:cx="http://schemas.microsoft.com/office/drawing/2014/chartex" xmlns:cx1="http://schemas.microsoft.com/office/drawing/2015/9/8/chartex" xmlns:cx2="http://schemas.microsoft.com/office/drawing/2015/10/21/chartex" xmlns:cx3="http://schemas.microsoft.com/office/drawing/2016/5/9/chartex" xmlns:cx4="http://schemas.microsoft.com/office/drawing/2016/5/10/chartex" xmlns:cx5="http://schemas.microsoft.com/office/drawing/2016/5/11/chartex" xmlns:cx6="http://schemas.microsoft.com/office/drawing/2016/5/12/chartex" xmlns:cx7="http://schemas.microsoft.com/office/drawing/2016/5/13/chartex" xmlns:cx8="http://schemas.microsoft.com/office/drawing/2016/5/14/chartex" xmlns:mc="http://schemas.openxmlformats.org/markup-compatibility/2006" xmlns:aink="http://schemas.microsoft.com/office/drawing/2016/ink" xmlns:am3d="http://schemas.microsoft.com/office/drawing/2017/model3d" xmlns:o="urn:schemas-microsoft-com:office:office" xmlns:oel="http://schemas.microsoft.com/office/2019/extlst" xmlns:r="http://schemas.openxmlformats.org/officeDocument/2006/relationships" xmlns:m="http://schemas.openxmlformats.org/officeDocument/2006/math" xmlns:v="urn:schemas-microsoft-com:vml" xmlns:wp14="http://schemas.microsoft.com/office/word/2010/wordprocessingDrawing" xmlns:wp="http://schemas.openxmlformats.org/drawingml/2006/wordprocessingDrawing" xmlns:w10="urn:schemas-microsoft-com:office:word" xmlns:w="http://schemas.openxmlformats.org/wordprocessingml/2006/main" xmlns:w14="http://schemas.microsoft.com/office/word/2010/wordml" xmlns:w15="http://schemas.microsoft.com/office/word/2012/wordml" xmlns:w16cex="http://schemas.microsoft.com/office/word/2018/wordml/cex" xmlns:w16cid="http://schemas.microsoft.com/office/word/2016/wordml/cid" xmlns:w16="http://schemas.microsoft.com/office/word/2018/wordml" xmlns:w16sdtdh="http://schemas.microsoft.com/office/word/2020/wordml/sdtdatahash" xmlns:w16se="http://schemas.microsoft.com/office/word/2015/wordml/symex" xmlns:wpg="http://schemas.microsoft.com/office/word/2010/wordprocessingGroup" xmlns:wpi="http://schemas.microsoft.com/office/word/2010/wordprocessingInk" xmlns:wne="http://schemas.microsoft.com/office/word/2006/wordml" xmlns:wps="http://schemas.microsoft.com/office/word/2010/wordprocessingShape" mc:Ignorable="w14 w15 w16se w16cid w16 w16cex w16sdtdh wp14">
+<w:hdr xmlns:wpc="http://schemas.microsoft.com/office/word/2010/wordprocessingCanvas" xmlns:cx="http://schemas.microsoft.com/office/drawing/2014/chartex" xmlns:cx1="http://schemas.microsoft.com/office/drawing/2015/9/8/chartex" xmlns:cx2="http://schemas.microsoft.com/office/drawing/2015/10/21/chartex" xmlns:cx3="http://schemas.microsoft.com/office/drawing/2016/5/9/chartex" xmlns:cx4="http://schemas.microsoft.com/office/drawing/2016/5/10/chartex" xmlns:cx5="http://schemas.microsoft.com/office/drawing/2016/5/11/chartex" xmlns:cx6="http://schemas.microsoft.com/office/drawing/2016/5/12/chartex" xmlns:cx7="http://schemas.microsoft.com/office/drawing/2016/5/13/chartex" xmlns:cx8="http://schemas.microsoft.com/office/drawing/2016/5/14/chartex" xmlns:mc="http://schemas.openxmlformats.org/markup-compatibility/2006" xmlns:aink="http://schemas.microsoft.com/office/drawing/2016/ink" xmlns:am3d="http://schemas.microsoft.com/office/drawing/2017/model3d" xmlns:o="urn:schemas-microsoft-com:office:office" xmlns:oel="http://schemas.microsoft.com/office/2019/extlst" xmlns:r="http://schemas.openxmlformats.org/officeDocument/2006/relationships" xmlns:m="http://schemas.openxmlformats.org/officeDocument/2006/math" xmlns:v="urn:schemas-microsoft-com:vml" xmlns:wp14="http://schemas.microsoft.com/office/word/2010/wordprocessingDrawing" xmlns:wp="http://schemas.openxmlformats.org/drawingml/2006/wordprocessingDrawing" xmlns:w10="urn:schemas-microsoft-com:office:word" xmlns:w="http://schemas.openxmlformats.org/wordprocessingml/2006/main" xmlns:w14="http://schemas.microsoft.com/office/word/2010/wordml" xmlns:w15="http://schemas.microsoft.com/office/word/2012/wordml" xmlns:w16cex="http://schemas.microsoft.com/office/word/2018/wordml/cex" xmlns:w16cid="http://schemas.microsoft.com/office/word/2016/wordml/cid" xmlns:w16="http://schemas.microsoft.com/office/word/2018/wordml" xmlns:w16du="http://schemas.microsoft.com/office/word/2023/wordml/word16du" xmlns:w16sdtdh="http://schemas.microsoft.com/office/word/2020/wordml/sdtdatahash" xmlns:w16sdtfl="http://schemas.microsoft.com/office/word/2024/wordml/sdtformatlock" xmlns:w16se="http://schemas.microsoft.com/office/word/2015/wordml/symex" xmlns:wpg="http://schemas.microsoft.com/office/word/2010/wordprocessingGroup" xmlns:wpi="http://schemas.microsoft.com/office/word/2010/wordprocessingInk" xmlns:wne="http://schemas.microsoft.com/office/word/2006/wordml" xmlns:wps="http://schemas.microsoft.com/office/word/2010/wordprocessingShape" mc:Ignorable="w14 w15 w16se w16cid w16 w16cex w16sdtdh w16sdtfl w16du wp14">
   <w:p>
     <w:pPr>
       <w:pStyle w:val="Header"/>
@@ -27135,7 +27133,7 @@
 </file>
 
 <file path=word/header2.xml><?xml version="1.0" encoding="utf-8"?>
-<w:hdr xmlns:wpc="http://schemas.microsoft.com/office/word/2010/wordprocessingCanvas" xmlns:cx="http://schemas.microsoft.com/office/drawing/2014/chartex" xmlns:cx1="http://schemas.microsoft.com/office/drawing/2015/9/8/chartex" xmlns:cx2="http://schemas.microsoft.com/office/drawing/2015/10/21/chartex" xmlns:cx3="http://schemas.microsoft.com/office/drawing/2016/5/9/chartex" xmlns:cx4="http://schemas.microsoft.com/office/drawing/2016/5/10/chartex" xmlns:cx5="http://schemas.microsoft.com/office/drawing/2016/5/11/chartex" xmlns:cx6="http://schemas.microsoft.com/office/drawing/2016/5/12/chartex" xmlns:cx7="http://schemas.microsoft.com/office/drawing/2016/5/13/chartex" xmlns:cx8="http://schemas.microsoft.com/office/drawing/2016/5/14/chartex" xmlns:mc="http://schemas.openxmlformats.org/markup-compatibility/2006" xmlns:aink="http://schemas.microsoft.com/office/drawing/2016/ink" xmlns:am3d="http://schemas.microsoft.com/office/drawing/2017/model3d" xmlns:o="urn:schemas-microsoft-com:office:office" xmlns:oel="http://schemas.microsoft.com/office/2019/extlst" xmlns:r="http://schemas.openxmlformats.org/officeDocument/2006/relationships" xmlns:m="http://schemas.openxmlformats.org/officeDocument/2006/math" xmlns:v="urn:schemas-microsoft-com:vml" xmlns:wp14="http://schemas.microsoft.com/office/word/2010/wordprocessingDrawing" xmlns:wp="http://schemas.openxmlformats.org/drawingml/2006/wordprocessingDrawing" xmlns:w10="urn:schemas-microsoft-com:office:word" xmlns:w="http://schemas.openxmlformats.org/wordprocessingml/2006/main" xmlns:w14="http://schemas.microsoft.com/office/word/2010/wordml" xmlns:w15="http://schemas.microsoft.com/office/word/2012/wordml" xmlns:w16cex="http://schemas.microsoft.com/office/word/2018/wordml/cex" xmlns:w16cid="http://schemas.microsoft.com/office/word/2016/wordml/cid" xmlns:w16="http://schemas.microsoft.com/office/word/2018/wordml" xmlns:w16sdtdh="http://schemas.microsoft.com/office/word/2020/wordml/sdtdatahash" xmlns:w16se="http://schemas.microsoft.com/office/word/2015/wordml/symex" xmlns:wpg="http://schemas.microsoft.com/office/word/2010/wordprocessingGroup" xmlns:wpi="http://schemas.microsoft.com/office/word/2010/wordprocessingInk" xmlns:wne="http://schemas.microsoft.com/office/word/2006/wordml" xmlns:wps="http://schemas.microsoft.com/office/word/2010/wordprocessingShape" mc:Ignorable="w14 w15 w16se w16cid w16 w16cex w16sdtdh wp14">
+<w:hdr xmlns:wpc="http://schemas.microsoft.com/office/word/2010/wordprocessingCanvas" xmlns:cx="http://schemas.microsoft.com/office/drawing/2014/chartex" xmlns:cx1="http://schemas.microsoft.com/office/drawing/2015/9/8/chartex" xmlns:cx2="http://schemas.microsoft.com/office/drawing/2015/10/21/chartex" xmlns:cx3="http://schemas.microsoft.com/office/drawing/2016/5/9/chartex" xmlns:cx4="http://schemas.microsoft.com/office/drawing/2016/5/10/chartex" xmlns:cx5="http://schemas.microsoft.com/office/drawing/2016/5/11/chartex" xmlns:cx6="http://schemas.microsoft.com/office/drawing/2016/5/12/chartex" xmlns:cx7="http://schemas.microsoft.com/office/drawing/2016/5/13/chartex" xmlns:cx8="http://schemas.microsoft.com/office/drawing/2016/5/14/chartex" xmlns:mc="http://schemas.openxmlformats.org/markup-compatibility/2006" xmlns:aink="http://schemas.microsoft.com/office/drawing/2016/ink" xmlns:am3d="http://schemas.microsoft.com/office/drawing/2017/model3d" xmlns:o="urn:schemas-microsoft-com:office:office" xmlns:oel="http://schemas.microsoft.com/office/2019/extlst" xmlns:r="http://schemas.openxmlformats.org/officeDocument/2006/relationships" xmlns:m="http://schemas.openxmlformats.org/officeDocument/2006/math" xmlns:v="urn:schemas-microsoft-com:vml" xmlns:wp14="http://schemas.microsoft.com/office/word/2010/wordprocessingDrawing" xmlns:wp="http://schemas.openxmlformats.org/drawingml/2006/wordprocessingDrawing" xmlns:w10="urn:schemas-microsoft-com:office:word" xmlns:w="http://schemas.openxmlformats.org/wordprocessingml/2006/main" xmlns:w14="http://schemas.microsoft.com/office/word/2010/wordml" xmlns:w15="http://schemas.microsoft.com/office/word/2012/wordml" xmlns:w16cex="http://schemas.microsoft.com/office/word/2018/wordml/cex" xmlns:w16cid="http://schemas.microsoft.com/office/word/2016/wordml/cid" xmlns:w16="http://schemas.microsoft.com/office/word/2018/wordml" xmlns:w16du="http://schemas.microsoft.com/office/word/2023/wordml/word16du" xmlns:w16sdtdh="http://schemas.microsoft.com/office/word/2020/wordml/sdtdatahash" xmlns:w16sdtfl="http://schemas.microsoft.com/office/word/2024/wordml/sdtformatlock" xmlns:w16se="http://schemas.microsoft.com/office/word/2015/wordml/symex" xmlns:wpg="http://schemas.microsoft.com/office/word/2010/wordprocessingGroup" xmlns:wpi="http://schemas.microsoft.com/office/word/2010/wordprocessingInk" xmlns:wne="http://schemas.microsoft.com/office/word/2006/wordml" xmlns:wps="http://schemas.microsoft.com/office/word/2010/wordprocessingShape" mc:Ignorable="w14 w15 w16se w16cid w16 w16cex w16sdtdh w16sdtfl w16du wp14">
   <w:p>
     <w:pPr>
       <w:pStyle w:val="Header"/>
@@ -27146,7 +27144,15 @@
         <w:sz w:val="20"/>
         <w:szCs w:val="20"/>
       </w:rPr>
-      <w:t xml:space="preserve">Iš viso </w:t>
+      <w:t xml:space="preserve">Iš </w:t>
+    </w:r>
+    <w:r>
+      <w:rPr>
+        <w:rFonts w:ascii="Times New Roman" w:hAnsi="Times New Roman"/>
+        <w:sz w:val="20"/>
+        <w:szCs w:val="20"/>
+      </w:rPr>
+      <w:t xml:space="preserve">viso </w:t>
     </w:r>
     <w:r>
       <w:rPr>
@@ -27225,7 +27231,7 @@
 </file>
 
 <file path=word/header3.xml><?xml version="1.0" encoding="utf-8"?>
-<w:hdr xmlns:wpc="http://schemas.microsoft.com/office/word/2010/wordprocessingCanvas" xmlns:cx="http://schemas.microsoft.com/office/drawing/2014/chartex" xmlns:cx1="http://schemas.microsoft.com/office/drawing/2015/9/8/chartex" xmlns:cx2="http://schemas.microsoft.com/office/drawing/2015/10/21/chartex" xmlns:cx3="http://schemas.microsoft.com/office/drawing/2016/5/9/chartex" xmlns:cx4="http://schemas.microsoft.com/office/drawing/2016/5/10/chartex" xmlns:cx5="http://schemas.microsoft.com/office/drawing/2016/5/11/chartex" xmlns:cx6="http://schemas.microsoft.com/office/drawing/2016/5/12/chartex" xmlns:cx7="http://schemas.microsoft.com/office/drawing/2016/5/13/chartex" xmlns:cx8="http://schemas.microsoft.com/office/drawing/2016/5/14/chartex" xmlns:mc="http://schemas.openxmlformats.org/markup-compatibility/2006" xmlns:aink="http://schemas.microsoft.com/office/drawing/2016/ink" xmlns:am3d="http://schemas.microsoft.com/office/drawing/2017/model3d" xmlns:o="urn:schemas-microsoft-com:office:office" xmlns:oel="http://schemas.microsoft.com/office/2019/extlst" xmlns:r="http://schemas.openxmlformats.org/officeDocument/2006/relationships" xmlns:m="http://schemas.openxmlformats.org/officeDocument/2006/math" xmlns:v="urn:schemas-microsoft-com:vml" xmlns:wp14="http://schemas.microsoft.com/office/word/2010/wordprocessingDrawing" xmlns:wp="http://schemas.openxmlformats.org/drawingml/2006/wordprocessingDrawing" xmlns:w10="urn:schemas-microsoft-com:office:word" xmlns:w="http://schemas.openxmlformats.org/wordprocessingml/2006/main" xmlns:w14="http://schemas.microsoft.com/office/word/2010/wordml" xmlns:w15="http://schemas.microsoft.com/office/word/2012/wordml" xmlns:w16cex="http://schemas.microsoft.com/office/word/2018/wordml/cex" xmlns:w16cid="http://schemas.microsoft.com/office/word/2016/wordml/cid" xmlns:w16="http://schemas.microsoft.com/office/word/2018/wordml" xmlns:w16sdtdh="http://schemas.microsoft.com/office/word/2020/wordml/sdtdatahash" xmlns:w16se="http://schemas.microsoft.com/office/word/2015/wordml/symex" xmlns:wpg="http://schemas.microsoft.com/office/word/2010/wordprocessingGroup" xmlns:wpi="http://schemas.microsoft.com/office/word/2010/wordprocessingInk" xmlns:wne="http://schemas.microsoft.com/office/word/2006/wordml" xmlns:wps="http://schemas.microsoft.com/office/word/2010/wordprocessingShape" mc:Ignorable="w14 w15 w16se w16cid w16 w16cex w16sdtdh wp14">
+<w:hdr xmlns:wpc="http://schemas.microsoft.com/office/word/2010/wordprocessingCanvas" xmlns:cx="http://schemas.microsoft.com/office/drawing/2014/chartex" xmlns:cx1="http://schemas.microsoft.com/office/drawing/2015/9/8/chartex" xmlns:cx2="http://schemas.microsoft.com/office/drawing/2015/10/21/chartex" xmlns:cx3="http://schemas.microsoft.com/office/drawing/2016/5/9/chartex" xmlns:cx4="http://schemas.microsoft.com/office/drawing/2016/5/10/chartex" xmlns:cx5="http://schemas.microsoft.com/office/drawing/2016/5/11/chartex" xmlns:cx6="http://schemas.microsoft.com/office/drawing/2016/5/12/chartex" xmlns:cx7="http://schemas.microsoft.com/office/drawing/2016/5/13/chartex" xmlns:cx8="http://schemas.microsoft.com/office/drawing/2016/5/14/chartex" xmlns:mc="http://schemas.openxmlformats.org/markup-compatibility/2006" xmlns:aink="http://schemas.microsoft.com/office/drawing/2016/ink" xmlns:am3d="http://schemas.microsoft.com/office/drawing/2017/model3d" xmlns:o="urn:schemas-microsoft-com:office:office" xmlns:oel="http://schemas.microsoft.com/office/2019/extlst" xmlns:r="http://schemas.openxmlformats.org/officeDocument/2006/relationships" xmlns:m="http://schemas.openxmlformats.org/officeDocument/2006/math" xmlns:v="urn:schemas-microsoft-com:vml" xmlns:wp14="http://schemas.microsoft.com/office/word/2010/wordprocessingDrawing" xmlns:wp="http://schemas.openxmlformats.org/drawingml/2006/wordprocessingDrawing" xmlns:w10="urn:schemas-microsoft-com:office:word" xmlns:w="http://schemas.openxmlformats.org/wordprocessingml/2006/main" xmlns:w14="http://schemas.microsoft.com/office/word/2010/wordml" xmlns:w15="http://schemas.microsoft.com/office/word/2012/wordml" xmlns:w16cex="http://schemas.microsoft.com/office/word/2018/wordml/cex" xmlns:w16cid="http://schemas.microsoft.com/office/word/2016/wordml/cid" xmlns:w16="http://schemas.microsoft.com/office/word/2018/wordml" xmlns:w16du="http://schemas.microsoft.com/office/word/2023/wordml/word16du" xmlns:w16sdtdh="http://schemas.microsoft.com/office/word/2020/wordml/sdtdatahash" xmlns:w16sdtfl="http://schemas.microsoft.com/office/word/2024/wordml/sdtformatlock" xmlns:w16se="http://schemas.microsoft.com/office/word/2015/wordml/symex" xmlns:wpg="http://schemas.microsoft.com/office/word/2010/wordprocessingGroup" xmlns:wpi="http://schemas.microsoft.com/office/word/2010/wordprocessingInk" xmlns:wne="http://schemas.microsoft.com/office/word/2006/wordml" xmlns:wps="http://schemas.microsoft.com/office/word/2010/wordprocessingShape" mc:Ignorable="w14 w15 w16se w16cid w16 w16cex w16sdtdh w16sdtfl w16du wp14">
   <w:p>
     <w:pPr>
       <w:pStyle w:val="Header"/>
@@ -27240,7 +27246,7 @@
 </file>
 
 <file path=word/header4.xml><?xml version="1.0" encoding="utf-8"?>
-<w:hdr xmlns:wpc="http://schemas.microsoft.com/office/word/2010/wordprocessingCanvas" xmlns:cx="http://schemas.microsoft.com/office/drawing/2014/chartex" xmlns:cx1="http://schemas.microsoft.com/office/drawing/2015/9/8/chartex" xmlns:cx2="http://schemas.microsoft.com/office/drawing/2015/10/21/chartex" xmlns:cx3="http://schemas.microsoft.com/office/drawing/2016/5/9/chartex" xmlns:cx4="http://schemas.microsoft.com/office/drawing/2016/5/10/chartex" xmlns:cx5="http://schemas.microsoft.com/office/drawing/2016/5/11/chartex" xmlns:cx6="http://schemas.microsoft.com/office/drawing/2016/5/12/chartex" xmlns:cx7="http://schemas.microsoft.com/office/drawing/2016/5/13/chartex" xmlns:cx8="http://schemas.microsoft.com/office/drawing/2016/5/14/chartex" xmlns:mc="http://schemas.openxmlformats.org/markup-compatibility/2006" xmlns:aink="http://schemas.microsoft.com/office/drawing/2016/ink" xmlns:am3d="http://schemas.microsoft.com/office/drawing/2017/model3d" xmlns:o="urn:schemas-microsoft-com:office:office" xmlns:oel="http://schemas.microsoft.com/office/2019/extlst" xmlns:r="http://schemas.openxmlformats.org/officeDocument/2006/relationships" xmlns:m="http://schemas.openxmlformats.org/officeDocument/2006/math" xmlns:v="urn:schemas-microsoft-com:vml" xmlns:wp14="http://schemas.microsoft.com/office/word/2010/wordprocessingDrawing" xmlns:wp="http://schemas.openxmlformats.org/drawingml/2006/wordprocessingDrawing" xmlns:w10="urn:schemas-microsoft-com:office:word" xmlns:w="http://schemas.openxmlformats.org/wordprocessingml/2006/main" xmlns:w14="http://schemas.microsoft.com/office/word/2010/wordml" xmlns:w15="http://schemas.microsoft.com/office/word/2012/wordml" xmlns:w16cex="http://schemas.microsoft.com/office/word/2018/wordml/cex" xmlns:w16cid="http://schemas.microsoft.com/office/word/2016/wordml/cid" xmlns:w16="http://schemas.microsoft.com/office/word/2018/wordml" xmlns:w16sdtdh="http://schemas.microsoft.com/office/word/2020/wordml/sdtdatahash" xmlns:w16se="http://schemas.microsoft.com/office/word/2015/wordml/symex" xmlns:wpg="http://schemas.microsoft.com/office/word/2010/wordprocessingGroup" xmlns:wpi="http://schemas.microsoft.com/office/word/2010/wordprocessingInk" xmlns:wne="http://schemas.microsoft.com/office/word/2006/wordml" xmlns:wps="http://schemas.microsoft.com/office/word/2010/wordprocessingShape" mc:Ignorable="w14 w15 w16se w16cid w16 w16cex w16sdtdh wp14">
+<w:hdr xmlns:wpc="http://schemas.microsoft.com/office/word/2010/wordprocessingCanvas" xmlns:cx="http://schemas.microsoft.com/office/drawing/2014/chartex" xmlns:cx1="http://schemas.microsoft.com/office/drawing/2015/9/8/chartex" xmlns:cx2="http://schemas.microsoft.com/office/drawing/2015/10/21/chartex" xmlns:cx3="http://schemas.microsoft.com/office/drawing/2016/5/9/chartex" xmlns:cx4="http://schemas.microsoft.com/office/drawing/2016/5/10/chartex" xmlns:cx5="http://schemas.microsoft.com/office/drawing/2016/5/11/chartex" xmlns:cx6="http://schemas.microsoft.com/office/drawing/2016/5/12/chartex" xmlns:cx7="http://schemas.microsoft.com/office/drawing/2016/5/13/chartex" xmlns:cx8="http://schemas.microsoft.com/office/drawing/2016/5/14/chartex" xmlns:mc="http://schemas.openxmlformats.org/markup-compatibility/2006" xmlns:aink="http://schemas.microsoft.com/office/drawing/2016/ink" xmlns:am3d="http://schemas.microsoft.com/office/drawing/2017/model3d" xmlns:o="urn:schemas-microsoft-com:office:office" xmlns:oel="http://schemas.microsoft.com/office/2019/extlst" xmlns:r="http://schemas.openxmlformats.org/officeDocument/2006/relationships" xmlns:m="http://schemas.openxmlformats.org/officeDocument/2006/math" xmlns:v="urn:schemas-microsoft-com:vml" xmlns:wp14="http://schemas.microsoft.com/office/word/2010/wordprocessingDrawing" xmlns:wp="http://schemas.openxmlformats.org/drawingml/2006/wordprocessingDrawing" xmlns:w10="urn:schemas-microsoft-com:office:word" xmlns:w="http://schemas.openxmlformats.org/wordprocessingml/2006/main" xmlns:w14="http://schemas.microsoft.com/office/word/2010/wordml" xmlns:w15="http://schemas.microsoft.com/office/word/2012/wordml" xmlns:w16cex="http://schemas.microsoft.com/office/word/2018/wordml/cex" xmlns:w16cid="http://schemas.microsoft.com/office/word/2016/wordml/cid" xmlns:w16="http://schemas.microsoft.com/office/word/2018/wordml" xmlns:w16du="http://schemas.microsoft.com/office/word/2023/wordml/word16du" xmlns:w16sdtdh="http://schemas.microsoft.com/office/word/2020/wordml/sdtdatahash" xmlns:w16sdtfl="http://schemas.microsoft.com/office/word/2024/wordml/sdtformatlock" xmlns:w16se="http://schemas.microsoft.com/office/word/2015/wordml/symex" xmlns:wpg="http://schemas.microsoft.com/office/word/2010/wordprocessingGroup" xmlns:wpi="http://schemas.microsoft.com/office/word/2010/wordprocessingInk" xmlns:wne="http://schemas.microsoft.com/office/word/2006/wordml" xmlns:wps="http://schemas.microsoft.com/office/word/2010/wordprocessingShape" mc:Ignorable="w14 w15 w16se w16cid w16 w16cex w16sdtdh w16sdtfl w16du wp14">
   <w:p>
     <w:pPr>
       <w:pStyle w:val="Header"/>
@@ -27260,7 +27266,15 @@
         <w:sz w:val="20"/>
         <w:szCs w:val="20"/>
       </w:rPr>
-      <w:t xml:space="preserve">Iš viso </w:t>
+      <w:t xml:space="preserve">Iš </w:t>
+    </w:r>
+    <w:r>
+      <w:rPr>
+        <w:rFonts w:ascii="Times New Roman" w:hAnsi="Times New Roman"/>
+        <w:sz w:val="20"/>
+        <w:szCs w:val="20"/>
+      </w:rPr>
+      <w:t xml:space="preserve">viso </w:t>
     </w:r>
     <w:r>
       <w:rPr>
@@ -27307,7 +27321,7 @@
 </file>
 
 <file path=word/numbering.xml><?xml version="1.0" encoding="utf-8"?>
-<w:numbering xmlns:wpc="http://schemas.microsoft.com/office/word/2010/wordprocessingCanvas" xmlns:cx="http://schemas.microsoft.com/office/drawing/2014/chartex" xmlns:cx1="http://schemas.microsoft.com/office/drawing/2015/9/8/chartex" xmlns:cx2="http://schemas.microsoft.com/office/drawing/2015/10/21/chartex" xmlns:cx3="http://schemas.microsoft.com/office/drawing/2016/5/9/chartex" xmlns:cx4="http://schemas.microsoft.com/office/drawing/2016/5/10/chartex" xmlns:cx5="http://schemas.microsoft.com/office/drawing/2016/5/11/chartex" xmlns:cx6="http://schemas.microsoft.com/office/drawing/2016/5/12/chartex" xmlns:cx7="http://schemas.microsoft.com/office/drawing/2016/5/13/chartex" xmlns:cx8="http://schemas.microsoft.com/office/drawing/2016/5/14/chartex" xmlns:mc="http://schemas.openxmlformats.org/markup-compatibility/2006" xmlns:aink="http://schemas.microsoft.com/office/drawing/2016/ink" xmlns:am3d="http://schemas.microsoft.com/office/drawing/2017/model3d" xmlns:o="urn:schemas-microsoft-com:office:office" xmlns:oel="http://schemas.microsoft.com/office/2019/extlst" xmlns:r="http://schemas.openxmlformats.org/officeDocument/2006/relationships" xmlns:m="http://schemas.openxmlformats.org/officeDocument/2006/math" xmlns:v="urn:schemas-microsoft-com:vml" xmlns:wp14="http://schemas.microsoft.com/office/word/2010/wordprocessingDrawing" xmlns:wp="http://schemas.openxmlformats.org/drawingml/2006/wordprocessingDrawing" xmlns:w10="urn:schemas-microsoft-com:office:word" xmlns:w="http://schemas.openxmlformats.org/wordprocessingml/2006/main" xmlns:w14="http://schemas.microsoft.com/office/word/2010/wordml" xmlns:w15="http://schemas.microsoft.com/office/word/2012/wordml" xmlns:w16cex="http://schemas.microsoft.com/office/word/2018/wordml/cex" xmlns:w16cid="http://schemas.microsoft.com/office/word/2016/wordml/cid" xmlns:w16="http://schemas.microsoft.com/office/word/2018/wordml" xmlns:w16sdtdh="http://schemas.microsoft.com/office/word/2020/wordml/sdtdatahash" xmlns:w16se="http://schemas.microsoft.com/office/word/2015/wordml/symex" xmlns:wpg="http://schemas.microsoft.com/office/word/2010/wordprocessingGroup" xmlns:wpi="http://schemas.microsoft.com/office/word/2010/wordprocessingInk" xmlns:wne="http://schemas.microsoft.com/office/word/2006/wordml" xmlns:wps="http://schemas.microsoft.com/office/word/2010/wordprocessingShape" mc:Ignorable="w14 w15 w16se w16cid w16 w16cex w16sdtdh wp14">
+<w:numbering xmlns:wpc="http://schemas.microsoft.com/office/word/2010/wordprocessingCanvas" xmlns:cx="http://schemas.microsoft.com/office/drawing/2014/chartex" xmlns:cx1="http://schemas.microsoft.com/office/drawing/2015/9/8/chartex" xmlns:cx2="http://schemas.microsoft.com/office/drawing/2015/10/21/chartex" xmlns:cx3="http://schemas.microsoft.com/office/drawing/2016/5/9/chartex" xmlns:cx4="http://schemas.microsoft.com/office/drawing/2016/5/10/chartex" xmlns:cx5="http://schemas.microsoft.com/office/drawing/2016/5/11/chartex" xmlns:cx6="http://schemas.microsoft.com/office/drawing/2016/5/12/chartex" xmlns:cx7="http://schemas.microsoft.com/office/drawing/2016/5/13/chartex" xmlns:cx8="http://schemas.microsoft.com/office/drawing/2016/5/14/chartex" xmlns:mc="http://schemas.openxmlformats.org/markup-compatibility/2006" xmlns:aink="http://schemas.microsoft.com/office/drawing/2016/ink" xmlns:am3d="http://schemas.microsoft.com/office/drawing/2017/model3d" xmlns:o="urn:schemas-microsoft-com:office:office" xmlns:oel="http://schemas.microsoft.com/office/2019/extlst" xmlns:r="http://schemas.openxmlformats.org/officeDocument/2006/relationships" xmlns:m="http://schemas.openxmlformats.org/officeDocument/2006/math" xmlns:v="urn:schemas-microsoft-com:vml" xmlns:wp14="http://schemas.microsoft.com/office/word/2010/wordprocessingDrawing" xmlns:wp="http://schemas.openxmlformats.org/drawingml/2006/wordprocessingDrawing" xmlns:w10="urn:schemas-microsoft-com:office:word" xmlns:w="http://schemas.openxmlformats.org/wordprocessingml/2006/main" xmlns:w14="http://schemas.microsoft.com/office/word/2010/wordml" xmlns:w15="http://schemas.microsoft.com/office/word/2012/wordml" xmlns:w16cex="http://schemas.microsoft.com/office/word/2018/wordml/cex" xmlns:w16cid="http://schemas.microsoft.com/office/word/2016/wordml/cid" xmlns:w16="http://schemas.microsoft.com/office/word/2018/wordml" xmlns:w16du="http://schemas.microsoft.com/office/word/2023/wordml/word16du" xmlns:w16sdtdh="http://schemas.microsoft.com/office/word/2020/wordml/sdtdatahash" xmlns:w16sdtfl="http://schemas.microsoft.com/office/word/2024/wordml/sdtformatlock" xmlns:w16se="http://schemas.microsoft.com/office/word/2015/wordml/symex" xmlns:wpg="http://schemas.microsoft.com/office/word/2010/wordprocessingGroup" xmlns:wpi="http://schemas.microsoft.com/office/word/2010/wordprocessingInk" xmlns:wne="http://schemas.microsoft.com/office/word/2006/wordml" xmlns:wps="http://schemas.microsoft.com/office/word/2010/wordprocessingShape" mc:Ignorable="w14 w15 w16se w16cid w16 w16cex w16sdtdh w16sdtfl w16du wp14">
   <w:abstractNum w:abstractNumId="0" w15:restartNumberingAfterBreak="0">
     <w:nsid w:val="11004D7C"/>
     <w:multiLevelType w:val="hybridMultilevel"/>
@@ -29861,7 +29875,7 @@
 </file>
 
 <file path=word/styles.xml><?xml version="1.0" encoding="utf-8"?>
-<w:styles xmlns:mc="http://schemas.openxmlformats.org/markup-compatibility/2006" xmlns:r="http://schemas.openxmlformats.org/officeDocument/2006/relationships" xmlns:w="http://schemas.openxmlformats.org/wordprocessingml/2006/main" xmlns:w14="http://schemas.microsoft.com/office/word/2010/wordml" xmlns:w15="http://schemas.microsoft.com/office/word/2012/wordml" xmlns:w16cex="http://schemas.microsoft.com/office/word/2018/wordml/cex" xmlns:w16cid="http://schemas.microsoft.com/office/word/2016/wordml/cid" xmlns:w16="http://schemas.microsoft.com/office/word/2018/wordml" xmlns:w16sdtdh="http://schemas.microsoft.com/office/word/2020/wordml/sdtdatahash" xmlns:w16se="http://schemas.microsoft.com/office/word/2015/wordml/symex" mc:Ignorable="w14 w15 w16se w16cid w16 w16cex w16sdtdh">
+<w:styles xmlns:mc="http://schemas.openxmlformats.org/markup-compatibility/2006" xmlns:r="http://schemas.openxmlformats.org/officeDocument/2006/relationships" xmlns:w="http://schemas.openxmlformats.org/wordprocessingml/2006/main" xmlns:w14="http://schemas.microsoft.com/office/word/2010/wordml" xmlns:w15="http://schemas.microsoft.com/office/word/2012/wordml" xmlns:w16cex="http://schemas.microsoft.com/office/word/2018/wordml/cex" xmlns:w16cid="http://schemas.microsoft.com/office/word/2016/wordml/cid" xmlns:w16="http://schemas.microsoft.com/office/word/2018/wordml" xmlns:w16du="http://schemas.microsoft.com/office/word/2023/wordml/word16du" xmlns:w16sdtdh="http://schemas.microsoft.com/office/word/2020/wordml/sdtdatahash" xmlns:w16sdtfl="http://schemas.microsoft.com/office/word/2024/wordml/sdtformatlock" xmlns:w16se="http://schemas.microsoft.com/office/word/2015/wordml/symex" mc:Ignorable="w14 w15 w16se w16cid w16 w16cex w16sdtdh w16sdtfl w16du">
   <w:docDefaults>
     <w:rPrDefault>
       <w:rPr>

</xml_diff>